<commit_message>
Update ERS - Zaqueu - Atualizado.docx
</commit_message>
<xml_diff>
--- a/Processo de Desenvolvimento de Software/ERS - Zaqueu - Atualizado.docx
+++ b/Processo de Desenvolvimento de Software/ERS - Zaqueu - Atualizado.docx
@@ -3701,6 +3701,7 @@
           <w:sz w:val="24"/>
           <w:szCs w:val="24"/>
         </w:rPr>
+        <w:lastRenderedPageBreak/>
         <w:t>INTRODUÇÃO</w:t>
       </w:r>
       <w:bookmarkEnd w:id="0"/>
@@ -4261,7 +4262,17 @@
           <w:szCs w:val="24"/>
           <w:lang w:eastAsia="pt-BR"/>
         </w:rPr>
-        <w:t>A aplicação do software se dará no contexto de comércios locais que necessitam de maior organização e controle de suas operações. Entre os principais benefícios proporcionados pelo sistema, destacam-se a redução de erros no controle de estoque, maior agilidade no processo de vendas, melhoria na organização das informações e aumento da produtividade dos usuários.</w:t>
+        <w:t xml:space="preserve">A aplicação do software se dará no contexto de comércios locais que necessitam de maior organização e controle de suas operações. Entre os </w:t>
+      </w:r>
+      <w:r>
+        <w:rPr>
+          <w:rFonts w:ascii="Arial" w:hAnsi="Arial" w:cs="Arial"/>
+          <w:sz w:val="24"/>
+          <w:szCs w:val="24"/>
+          <w:lang w:eastAsia="pt-BR"/>
+        </w:rPr>
+        <w:lastRenderedPageBreak/>
+        <w:t>principais benefícios proporcionados pelo sistema, destacam-se a redução de erros no controle de estoque, maior agilidade no processo de vendas, melhoria na organização das informações e aumento da produtividade dos usuários.</w:t>
       </w:r>
     </w:p>
     <w:p>
@@ -6407,6 +6418,7 @@
                 <w:sz w:val="24"/>
                 <w:szCs w:val="24"/>
               </w:rPr>
+              <w:lastRenderedPageBreak/>
               <w:t>Benchmark de Sistemas logístico</w:t>
             </w:r>
           </w:p>
@@ -7373,7 +7385,16 @@
           <w:sz w:val="24"/>
           <w:szCs w:val="24"/>
         </w:rPr>
-        <w:t xml:space="preserve"> O usuário poderá emitir um relatório dos pedidos realizados pelo canal online, filtrando por período e/ou status do pedido. Itens de entrada (filtros): data inicial, data final e status do pedido (opcional). Itens de saída: cliente, produto(s), quantidade, data do pedido, status atual e valor total do pedido.</w:t>
+        <w:t xml:space="preserve"> O usuário poderá emitir um relatório dos pedidos realizados pelo canal online, filtrando por período e/ou status do pedido. Itens de </w:t>
+      </w:r>
+      <w:r>
+        <w:rPr>
+          <w:rFonts w:ascii="Arial" w:hAnsi="Arial" w:cs="Arial"/>
+          <w:sz w:val="24"/>
+          <w:szCs w:val="24"/>
+        </w:rPr>
+        <w:lastRenderedPageBreak/>
+        <w:t>entrada (filtros): data inicial, data final e status do pedido (opcional). Itens de saída: cliente, produto(s), quantidade, data do pedido, status atual e valor total do pedido.</w:t>
       </w:r>
     </w:p>
     <w:p>
@@ -8304,7 +8325,16 @@
           <w:sz w:val="24"/>
           <w:szCs w:val="24"/>
         </w:rPr>
-        <w:t xml:space="preserve">A suposição é de que o cliente adquirirá os equipamentos descritos no Estudo de Viabilidade (item 2.6). Caso os computadores não sejam adquiridos conforme especificado, o desempenho do sistema poderá ser comprometido. </w:t>
+        <w:t xml:space="preserve">A suposição é de que o cliente adquirirá os equipamentos descritos no Estudo de Viabilidade (item 2.6). Caso os computadores não sejam </w:t>
+      </w:r>
+      <w:r>
+        <w:rPr>
+          <w:rFonts w:ascii="Arial" w:eastAsia="Calibri" w:hAnsi="Arial" w:cs="Arial"/>
+          <w:sz w:val="24"/>
+          <w:szCs w:val="24"/>
+        </w:rPr>
+        <w:lastRenderedPageBreak/>
+        <w:t xml:space="preserve">adquiridos conforme especificado, o desempenho do sistema poderá ser comprometido. </w:t>
       </w:r>
     </w:p>
     <w:p>
@@ -10175,6 +10205,7 @@
           <w:sz w:val="24"/>
           <w:szCs w:val="24"/>
         </w:rPr>
+        <w:lastRenderedPageBreak/>
         <mc:AlternateContent>
           <mc:Choice Requires="wps">
             <w:drawing>
@@ -10588,6 +10619,7 @@
           <w:sz w:val="24"/>
           <w:szCs w:val="24"/>
         </w:rPr>
+        <w:lastRenderedPageBreak/>
         <w:t>Produto estar cadastrado com estoque disponível</w:t>
       </w:r>
     </w:p>
@@ -11188,6 +11220,7 @@
           <w:sz w:val="24"/>
           <w:szCs w:val="24"/>
         </w:rPr>
+        <w:lastRenderedPageBreak/>
         <w:t>Pré-condição:</w:t>
       </w:r>
     </w:p>
@@ -11812,6 +11845,7 @@
           <w:sz w:val="24"/>
           <w:szCs w:val="24"/>
         </w:rPr>
+        <w:lastRenderedPageBreak/>
         <w:t>Pós-condição:</w:t>
       </w:r>
     </w:p>
@@ -12265,6 +12299,7 @@
           <w:sz w:val="24"/>
           <w:szCs w:val="24"/>
         </w:rPr>
+        <w:lastRenderedPageBreak/>
         <w:t>DIAGRAMA DE ATIVIDADES</w:t>
       </w:r>
       <w:bookmarkEnd w:id="27"/>
@@ -12438,6 +12473,7 @@
           <w:sz w:val="24"/>
           <w:szCs w:val="24"/>
         </w:rPr>
+        <w:lastRenderedPageBreak/>
         <w:t xml:space="preserve">CASO DE USO: </w:t>
       </w:r>
       <w:bookmarkEnd w:id="29"/>
@@ -12658,6 +12694,7 @@
           <w:sz w:val="24"/>
           <w:szCs w:val="24"/>
         </w:rPr>
+        <w:lastRenderedPageBreak/>
         <w:t xml:space="preserve">CASO DE USO: </w:t>
       </w:r>
       <w:r>
@@ -12916,9 +12953,45 @@
           <w:sz w:val="24"/>
           <w:szCs w:val="24"/>
         </w:rPr>
-        <w:t>CASO DE USO: RF_F01 – Fechar Ordem de Serviço</w:t>
+        <w:t xml:space="preserve">CASO DE USO: </w:t>
       </w:r>
       <w:bookmarkEnd w:id="32"/>
+      <w:r>
+        <w:rPr>
+          <w:rStyle w:val="Ttulo2Char"/>
+          <w:rFonts w:ascii="Arial" w:hAnsi="Arial" w:cs="Arial"/>
+          <w:color w:val="auto"/>
+          <w:sz w:val="24"/>
+          <w:szCs w:val="24"/>
+        </w:rPr>
+        <w:t xml:space="preserve">CASO DE USO: </w:t>
+      </w:r>
+      <w:r>
+        <w:rPr>
+          <w:b/>
+          <w:bCs/>
+          <w:color w:val="auto"/>
+          <w:sz w:val="24"/>
+          <w:szCs w:val="24"/>
+        </w:rPr>
+        <w:t>RF_F01 – Registrar Venda</w:t>
+      </w:r>
+    </w:p>
+    <w:p>
+      <w:pPr>
+        <w:pStyle w:val="Titulo3"/>
+        <w:numPr>
+          <w:ilvl w:val="0"/>
+          <w:numId w:val="0"/>
+        </w:numPr>
+        <w:rPr>
+          <w:rStyle w:val="Ttulo2Char"/>
+          <w:rFonts w:ascii="Arial" w:hAnsi="Arial" w:cs="Arial"/>
+          <w:color w:val="auto"/>
+          <w:sz w:val="24"/>
+          <w:szCs w:val="24"/>
+        </w:rPr>
+      </w:pPr>
     </w:p>
     <w:p>
       <w:pPr>
@@ -13008,9 +13081,19 @@
           <w:sz w:val="24"/>
           <w:szCs w:val="24"/>
         </w:rPr>
-        <w:t>CASO DE USO: RF_F01 – Fechar Ordem de Serviço</w:t>
+        <w:t xml:space="preserve">CASO DE USO: </w:t>
       </w:r>
       <w:bookmarkEnd w:id="33"/>
+      <w:r>
+        <w:rPr>
+          <w:rFonts w:eastAsia="Calibri"/>
+          <w:b/>
+          <w:bCs/>
+          <w:sz w:val="24"/>
+          <w:szCs w:val="24"/>
+        </w:rPr>
+        <w:t>RF_F02 – Registrar Entrada de Produto no Estoque</w:t>
+      </w:r>
     </w:p>
     <w:p>
       <w:pPr>
@@ -13057,6 +13140,55 @@
           <w:szCs w:val="24"/>
         </w:rPr>
         <w:t>.</w:t>
+      </w:r>
+    </w:p>
+    <w:p>
+      <w:pPr>
+        <w:ind w:left="708"/>
+        <w:jc w:val="both"/>
+        <w:rPr>
+          <w:rFonts w:ascii="Arial" w:eastAsia="Calibri" w:hAnsi="Arial" w:cs="Arial"/>
+          <w:color w:val="00B050"/>
+          <w:sz w:val="24"/>
+          <w:szCs w:val="24"/>
+        </w:rPr>
+      </w:pPr>
+    </w:p>
+    <w:p>
+      <w:pPr>
+        <w:pStyle w:val="Titulo3"/>
+        <w:numPr>
+          <w:ilvl w:val="2"/>
+          <w:numId w:val="28"/>
+        </w:numPr>
+        <w:ind w:left="708"/>
+        <w:rPr>
+          <w:rFonts w:eastAsia="Calibri"/>
+          <w:color w:val="00B050"/>
+          <w:sz w:val="24"/>
+          <w:szCs w:val="24"/>
+        </w:rPr>
+      </w:pPr>
+      <w:r>
+        <w:rPr>
+          <w:rStyle w:val="Ttulo2Char"/>
+          <w:rFonts w:ascii="Arial" w:hAnsi="Arial" w:cs="Arial"/>
+          <w:color w:val="auto"/>
+          <w:sz w:val="24"/>
+          <w:szCs w:val="24"/>
+        </w:rPr>
+        <w:lastRenderedPageBreak/>
+        <w:t xml:space="preserve">CASO DE USO: </w:t>
+      </w:r>
+      <w:r>
+        <w:rPr>
+          <w:rFonts w:eastAsia="Calibri"/>
+          <w:b/>
+          <w:bCs/>
+          <w:sz w:val="24"/>
+          <w:szCs w:val="24"/>
+        </w:rPr>
+        <w:t>RF_F03 – Processar Pedido Online</w:t>
       </w:r>
     </w:p>
     <w:p>
@@ -13392,7 +13524,14 @@
         <w:rPr>
           <w:rFonts w:ascii="Arial" w:hAnsi="Arial" w:cs="Arial"/>
         </w:rPr>
-        <w:t>. A interface utiliza uma estrutura limpa e organizada, com menu lateral fixo para navegação entre os módulos do sistema. O layout prioriza a produtividade do usuário, apresentando formulários, tabelas e indicadores de forma clara e intuitiva.</w:t>
+        <w:t xml:space="preserve">. A interface utiliza uma estrutura limpa e organizada, com menu lateral fixo para navegação entre os </w:t>
+      </w:r>
+      <w:r>
+        <w:rPr>
+          <w:rFonts w:ascii="Arial" w:hAnsi="Arial" w:cs="Arial"/>
+        </w:rPr>
+        <w:lastRenderedPageBreak/>
+        <w:t>módulos do sistema. O layout prioriza a produtividade do usuário, apresentando formulários, tabelas e indicadores de forma clara e intuitiva.</w:t>
       </w:r>
     </w:p>
     <w:p>
@@ -14801,7 +14940,14 @@
         <w:rPr>
           <w:rFonts w:ascii="Arial" w:hAnsi="Arial" w:cs="Arial"/>
         </w:rPr>
-        <w:t xml:space="preserve"> foi projetada para transmitir organização, confiabilidade e profissionalismo. A combinação entre tons de azul escuro, branco e cinza claro cria um ambiente corporativo moderno, enquanto a disposição dos elementos favorece a navegação rápida e o acesso eficiente às informações de clientes, vendas, estoque e entregas.</w:t>
+        <w:t xml:space="preserve"> foi projetada para transmitir organização, confiabilidade e profissionalismo. A combinação entre tons de azul </w:t>
+      </w:r>
+      <w:r>
+        <w:rPr>
+          <w:rFonts w:ascii="Arial" w:hAnsi="Arial" w:cs="Arial"/>
+        </w:rPr>
+        <w:lastRenderedPageBreak/>
+        <w:t>escuro, branco e cinza claro cria um ambiente corporativo moderno, enquanto a disposição dos elementos favorece a navegação rápida e o acesso eficiente às informações de clientes, vendas, estoque e entregas.</w:t>
       </w:r>
     </w:p>
     <w:p>
@@ -15478,6 +15624,7 @@
           <w:b/>
           <w:bCs/>
         </w:rPr>
+        <w:lastRenderedPageBreak/>
         <w:t>RF_B0</w:t>
       </w:r>
       <w:r>
@@ -15801,6 +15948,7 @@
           <w:b/>
           <w:bCs/>
         </w:rPr>
+        <w:lastRenderedPageBreak/>
         <w:t>RF_B0</w:t>
       </w:r>
       <w:r>
@@ -16081,6 +16229,7 @@
           <w:sz w:val="24"/>
           <w:szCs w:val="24"/>
         </w:rPr>
+        <w:lastRenderedPageBreak/>
         <w:t xml:space="preserve">HISTÓRICO DE </w:t>
       </w:r>
       <w:r>
@@ -16653,7 +16802,6 @@
         <w:docPartUnique/>
       </w:docPartObj>
     </w:sdtPr>
-    <w:sdtEndPr/>
     <w:sdtContent>
       <w:p>
         <w:pPr>

</xml_diff>

<commit_message>
ERS atualizado com Diagrama de sequencia
</commit_message>
<xml_diff>
--- a/Processo de Desenvolvimento de Software/ERS - Zaqueu - Atualizado.docx
+++ b/Processo de Desenvolvimento de Software/ERS - Zaqueu - Atualizado.docx
@@ -188,34 +188,14 @@
           <w:szCs w:val="52"/>
         </w:rPr>
       </w:pPr>
-      <w:proofErr w:type="spellStart"/>
       <w:r>
         <w:rPr>
           <w:rFonts w:ascii="Arial" w:hAnsi="Arial" w:cs="Arial"/>
           <w:sz w:val="44"/>
           <w:szCs w:val="52"/>
         </w:rPr>
-        <w:t>Amely</w:t>
-      </w:r>
-      <w:proofErr w:type="spellEnd"/>
-      <w:r>
-        <w:rPr>
-          <w:rFonts w:ascii="Arial" w:hAnsi="Arial" w:cs="Arial"/>
-          <w:sz w:val="44"/>
-          <w:szCs w:val="52"/>
-        </w:rPr>
-        <w:t xml:space="preserve"> </w:t>
-      </w:r>
-      <w:proofErr w:type="spellStart"/>
-      <w:r>
-        <w:rPr>
-          <w:rFonts w:ascii="Arial" w:hAnsi="Arial" w:cs="Arial"/>
-          <w:sz w:val="44"/>
-          <w:szCs w:val="52"/>
-        </w:rPr>
-        <w:t>Logistic</w:t>
-      </w:r>
-      <w:proofErr w:type="spellEnd"/>
+        <w:t>Amely Logistic</w:t>
+      </w:r>
     </w:p>
     <w:p>
       <w:pPr>
@@ -356,15 +336,7 @@
           <w:sz w:val="36"/>
           <w:szCs w:val="52"/>
         </w:rPr>
-        <w:t>20</w:t>
-      </w:r>
-      <w:r>
-        <w:rPr>
-          <w:rFonts w:ascii="Arial" w:hAnsi="Arial" w:cs="Arial"/>
-          <w:sz w:val="36"/>
-          <w:szCs w:val="52"/>
-        </w:rPr>
-        <w:t>26</w:t>
+        <w:t>2026</w:t>
       </w:r>
     </w:p>
     <w:p>
@@ -3762,55 +3734,7 @@
           <w:sz w:val="24"/>
           <w:szCs w:val="24"/>
         </w:rPr>
-        <w:t xml:space="preserve">O objetivo principal desta ERS consiste em inteirar todos os envolvidos, tanto no desenvolvimento quanto na </w:t>
-      </w:r>
-      <w:r>
-        <w:rPr>
-          <w:rFonts w:ascii="Arial" w:hAnsi="Arial" w:cs="Arial"/>
-          <w:sz w:val="24"/>
-          <w:szCs w:val="24"/>
-        </w:rPr>
-        <w:t>utilização</w:t>
-      </w:r>
-      <w:r>
-        <w:rPr>
-          <w:rFonts w:ascii="Arial" w:hAnsi="Arial" w:cs="Arial"/>
-          <w:sz w:val="24"/>
-          <w:szCs w:val="24"/>
-        </w:rPr>
-        <w:t xml:space="preserve"> do sistema, fornecendo </w:t>
-      </w:r>
-      <w:r>
-        <w:rPr>
-          <w:rFonts w:ascii="Arial" w:hAnsi="Arial" w:cs="Arial"/>
-          <w:sz w:val="24"/>
-          <w:szCs w:val="24"/>
-        </w:rPr>
-        <w:t>auxílio</w:t>
-      </w:r>
-      <w:r>
-        <w:rPr>
-          <w:rFonts w:ascii="Arial" w:hAnsi="Arial" w:cs="Arial"/>
-          <w:sz w:val="24"/>
-          <w:szCs w:val="24"/>
-        </w:rPr>
-        <w:t xml:space="preserve"> ao cliente e desenvolvedores envolvidos no projeto, para que todas as </w:t>
-      </w:r>
-      <w:r>
-        <w:rPr>
-          <w:rFonts w:ascii="Arial" w:hAnsi="Arial" w:cs="Arial"/>
-          <w:sz w:val="24"/>
-          <w:szCs w:val="24"/>
-        </w:rPr>
-        <w:t>dúvidas</w:t>
-      </w:r>
-      <w:r>
-        <w:rPr>
-          <w:rFonts w:ascii="Arial" w:hAnsi="Arial" w:cs="Arial"/>
-          <w:sz w:val="24"/>
-          <w:szCs w:val="24"/>
-        </w:rPr>
-        <w:t xml:space="preserve"> sejam sanadas.</w:t>
+        <w:t>O objetivo principal desta ERS consiste em inteirar todos os envolvidos, tanto no desenvolvimento quanto na utilização do sistema, fornecendo auxílio ao cliente e desenvolvedores envolvidos no projeto, para que todas as dúvidas sejam sanadas.</w:t>
       </w:r>
     </w:p>
     <w:p>
@@ -3831,39 +3755,7 @@
           <w:sz w:val="24"/>
           <w:szCs w:val="24"/>
         </w:rPr>
-        <w:t xml:space="preserve">Nesta ERS </w:t>
-      </w:r>
-      <w:r>
-        <w:rPr>
-          <w:rFonts w:ascii="Arial" w:hAnsi="Arial" w:cs="Arial"/>
-          <w:sz w:val="24"/>
-          <w:szCs w:val="24"/>
-        </w:rPr>
-        <w:t>estarão</w:t>
-      </w:r>
-      <w:r>
-        <w:rPr>
-          <w:rFonts w:ascii="Arial" w:hAnsi="Arial" w:cs="Arial"/>
-          <w:sz w:val="24"/>
-          <w:szCs w:val="24"/>
-        </w:rPr>
-        <w:t xml:space="preserve"> descritas todas as necessidades do cliente de maneira que possibilite total </w:t>
-      </w:r>
-      <w:r>
-        <w:rPr>
-          <w:rFonts w:ascii="Arial" w:hAnsi="Arial" w:cs="Arial"/>
-          <w:sz w:val="24"/>
-          <w:szCs w:val="24"/>
-        </w:rPr>
-        <w:t>compreensão</w:t>
-      </w:r>
-      <w:r>
-        <w:rPr>
-          <w:rFonts w:ascii="Arial" w:hAnsi="Arial" w:cs="Arial"/>
-          <w:sz w:val="24"/>
-          <w:szCs w:val="24"/>
-        </w:rPr>
-        <w:t xml:space="preserve"> do desenvolvedor.</w:t>
+        <w:t>Nesta ERS estarão descritas todas as necessidades do cliente de maneira que possibilite total compreensão do desenvolvedor.</w:t>
       </w:r>
     </w:p>
     <w:p>
@@ -3884,119 +3776,7 @@
           <w:sz w:val="24"/>
           <w:szCs w:val="24"/>
         </w:rPr>
-        <w:t xml:space="preserve">Todas as </w:t>
-      </w:r>
-      <w:r>
-        <w:rPr>
-          <w:rFonts w:ascii="Arial" w:hAnsi="Arial" w:cs="Arial"/>
-          <w:sz w:val="24"/>
-          <w:szCs w:val="24"/>
-        </w:rPr>
-        <w:t>funções</w:t>
-      </w:r>
-      <w:r>
-        <w:rPr>
-          <w:rFonts w:ascii="Arial" w:hAnsi="Arial" w:cs="Arial"/>
-          <w:sz w:val="24"/>
-          <w:szCs w:val="24"/>
-        </w:rPr>
-        <w:t xml:space="preserve"> que </w:t>
-      </w:r>
-      <w:r>
-        <w:rPr>
-          <w:rFonts w:ascii="Arial" w:hAnsi="Arial" w:cs="Arial"/>
-          <w:sz w:val="24"/>
-          <w:szCs w:val="24"/>
-        </w:rPr>
-        <w:t>estarão</w:t>
-      </w:r>
-      <w:r>
-        <w:rPr>
-          <w:rFonts w:ascii="Arial" w:hAnsi="Arial" w:cs="Arial"/>
-          <w:sz w:val="24"/>
-          <w:szCs w:val="24"/>
-        </w:rPr>
-        <w:t xml:space="preserve"> </w:t>
-      </w:r>
-      <w:r>
-        <w:rPr>
-          <w:rFonts w:ascii="Arial" w:hAnsi="Arial" w:cs="Arial"/>
-          <w:sz w:val="24"/>
-          <w:szCs w:val="24"/>
-        </w:rPr>
-        <w:t>disponíveis</w:t>
-      </w:r>
-      <w:r>
-        <w:rPr>
-          <w:rFonts w:ascii="Arial" w:hAnsi="Arial" w:cs="Arial"/>
-          <w:sz w:val="24"/>
-          <w:szCs w:val="24"/>
-        </w:rPr>
-        <w:t xml:space="preserve"> no Sistema </w:t>
-      </w:r>
-      <w:r>
-        <w:rPr>
-          <w:rFonts w:ascii="Arial" w:hAnsi="Arial" w:cs="Arial"/>
-          <w:sz w:val="24"/>
-          <w:szCs w:val="24"/>
-        </w:rPr>
-        <w:t>estarão</w:t>
-      </w:r>
-      <w:r>
-        <w:rPr>
-          <w:rFonts w:ascii="Arial" w:hAnsi="Arial" w:cs="Arial"/>
-          <w:sz w:val="24"/>
-          <w:szCs w:val="24"/>
-        </w:rPr>
-        <w:t xml:space="preserve"> descritas nesta ERS, assim como </w:t>
-      </w:r>
-      <w:r>
-        <w:rPr>
-          <w:rFonts w:ascii="Arial" w:hAnsi="Arial" w:cs="Arial"/>
-          <w:sz w:val="24"/>
-          <w:szCs w:val="24"/>
-        </w:rPr>
-        <w:t>definições</w:t>
-      </w:r>
-      <w:r>
-        <w:rPr>
-          <w:rFonts w:ascii="Arial" w:hAnsi="Arial" w:cs="Arial"/>
-          <w:sz w:val="24"/>
-          <w:szCs w:val="24"/>
-        </w:rPr>
-        <w:t xml:space="preserve"> detalhadas feitas pelo desenvolvedor, como as </w:t>
-      </w:r>
-      <w:r>
-        <w:rPr>
-          <w:rFonts w:ascii="Arial" w:hAnsi="Arial" w:cs="Arial"/>
-          <w:sz w:val="24"/>
-          <w:szCs w:val="24"/>
-        </w:rPr>
-        <w:t>limitações</w:t>
-      </w:r>
-      <w:r>
-        <w:rPr>
-          <w:rFonts w:ascii="Arial" w:hAnsi="Arial" w:cs="Arial"/>
-          <w:sz w:val="24"/>
-          <w:szCs w:val="24"/>
-        </w:rPr>
-        <w:t xml:space="preserve"> que o Sistema </w:t>
-      </w:r>
-      <w:r>
-        <w:rPr>
-          <w:rFonts w:ascii="Arial" w:hAnsi="Arial" w:cs="Arial"/>
-          <w:sz w:val="24"/>
-          <w:szCs w:val="24"/>
-        </w:rPr>
-        <w:t>terá</w:t>
-      </w:r>
-      <w:r>
-        <w:rPr>
-          <w:rFonts w:ascii="Arial" w:hAnsi="Arial" w:cs="Arial"/>
-          <w:sz w:val="24"/>
-          <w:szCs w:val="24"/>
-        </w:rPr>
-        <w:t>́.</w:t>
+        <w:t>Todas as funções que estarão disponíveis no Sistema estarão descritas nesta ERS, assim como definições detalhadas feitas pelo desenvolvedor, como as limitações que o Sistema terá́.</w:t>
       </w:r>
     </w:p>
     <w:p>
@@ -4017,23 +3797,7 @@
           <w:sz w:val="24"/>
           <w:szCs w:val="24"/>
         </w:rPr>
-        <w:t xml:space="preserve">O </w:t>
-      </w:r>
-      <w:r>
-        <w:rPr>
-          <w:rFonts w:ascii="Arial" w:hAnsi="Arial" w:cs="Arial"/>
-          <w:sz w:val="24"/>
-          <w:szCs w:val="24"/>
-        </w:rPr>
-        <w:t>público</w:t>
-      </w:r>
-      <w:r>
-        <w:rPr>
-          <w:rFonts w:ascii="Arial" w:hAnsi="Arial" w:cs="Arial"/>
-          <w:sz w:val="24"/>
-          <w:szCs w:val="24"/>
-        </w:rPr>
-        <w:t xml:space="preserve"> alvo desta ERS consiste no cliente, nos desenvolvedores e nos analistas.</w:t>
+        <w:t>O público alvo desta ERS consiste no cliente, nos desenvolvedores e nos analistas.</w:t>
       </w:r>
       <w:commentRangeEnd w:id="2"/>
       <w:r>
@@ -4118,7 +3882,6 @@
         </w:rPr>
         <w:t xml:space="preserve">O produto de software a ser desenvolvido denomina-se </w:t>
       </w:r>
-      <w:proofErr w:type="spellStart"/>
       <w:r>
         <w:rPr>
           <w:rFonts w:ascii="Arial" w:hAnsi="Arial" w:cs="Arial"/>
@@ -4127,31 +3890,8 @@
           <w:szCs w:val="24"/>
           <w:lang w:eastAsia="pt-BR"/>
         </w:rPr>
-        <w:t>Amely</w:t>
-      </w:r>
-      <w:proofErr w:type="spellEnd"/>
-      <w:r>
-        <w:rPr>
-          <w:rFonts w:ascii="Arial" w:hAnsi="Arial" w:cs="Arial"/>
-          <w:bCs/>
-          <w:sz w:val="24"/>
-          <w:szCs w:val="24"/>
-          <w:lang w:eastAsia="pt-BR"/>
-        </w:rPr>
-        <w:t xml:space="preserve"> </w:t>
-      </w:r>
-      <w:proofErr w:type="spellStart"/>
-      <w:r>
-        <w:rPr>
-          <w:rFonts w:ascii="Arial" w:hAnsi="Arial" w:cs="Arial"/>
-          <w:bCs/>
-          <w:sz w:val="24"/>
-          <w:szCs w:val="24"/>
-          <w:lang w:eastAsia="pt-BR"/>
-        </w:rPr>
-        <w:t>Logistic</w:t>
-      </w:r>
-      <w:proofErr w:type="spellEnd"/>
+        <w:t>Amely Logistic</w:t>
+      </w:r>
       <w:r>
         <w:rPr>
           <w:rFonts w:ascii="Arial" w:hAnsi="Arial" w:cs="Arial"/>
@@ -4183,7 +3923,6 @@
         </w:rPr>
         <w:t xml:space="preserve">O </w:t>
       </w:r>
-      <w:proofErr w:type="spellStart"/>
       <w:r>
         <w:rPr>
           <w:rFonts w:ascii="Arial" w:hAnsi="Arial" w:cs="Arial"/>
@@ -4192,57 +3931,16 @@
           <w:szCs w:val="24"/>
           <w:lang w:eastAsia="pt-BR"/>
         </w:rPr>
-        <w:t>Amely</w:t>
-      </w:r>
-      <w:proofErr w:type="spellEnd"/>
-      <w:r>
-        <w:rPr>
-          <w:rFonts w:ascii="Arial" w:hAnsi="Arial" w:cs="Arial"/>
-          <w:bCs/>
+        <w:t>Amely Logistic</w:t>
+      </w:r>
+      <w:r>
+        <w:rPr>
+          <w:rFonts w:ascii="Arial" w:hAnsi="Arial" w:cs="Arial"/>
           <w:sz w:val="24"/>
           <w:szCs w:val="24"/>
           <w:lang w:eastAsia="pt-BR"/>
         </w:rPr>
-        <w:t xml:space="preserve"> </w:t>
-      </w:r>
-      <w:proofErr w:type="spellStart"/>
-      <w:r>
-        <w:rPr>
-          <w:rFonts w:ascii="Arial" w:hAnsi="Arial" w:cs="Arial"/>
-          <w:bCs/>
-          <w:sz w:val="24"/>
-          <w:szCs w:val="24"/>
-          <w:lang w:eastAsia="pt-BR"/>
-        </w:rPr>
-        <w:t>Logistic</w:t>
-      </w:r>
-      <w:proofErr w:type="spellEnd"/>
-      <w:r>
-        <w:rPr>
-          <w:rFonts w:ascii="Arial" w:hAnsi="Arial" w:cs="Arial"/>
-          <w:sz w:val="24"/>
-          <w:szCs w:val="24"/>
-          <w:lang w:eastAsia="pt-BR"/>
-        </w:rPr>
-        <w:t xml:space="preserve"> será responsável por permitir o cadastro e gerenciamento de clientes, fornecedores e vendedores, além de possibilitar o controle de entradas e saídas de produtos. O sistema também contemplará funcionalidades de vendas online, integrando o fluxo de pedidos com o controle de estoque, fornecendo informações atualizadas ao setor administrativo. Dessa forma, o software contribuirá para a centralização das informações e para a tomada de decisões mais assertivas.</w:t>
-      </w:r>
-      <w:r>
-        <w:rPr>
-          <w:rFonts w:ascii="Arial" w:hAnsi="Arial" w:cs="Arial"/>
-          <w:sz w:val="24"/>
-          <w:szCs w:val="24"/>
-          <w:lang w:eastAsia="pt-BR"/>
-        </w:rPr>
-        <w:t xml:space="preserve"> </w:t>
-      </w:r>
-      <w:r>
-        <w:rPr>
-          <w:rFonts w:ascii="Arial" w:hAnsi="Arial" w:cs="Arial"/>
-          <w:sz w:val="24"/>
-          <w:szCs w:val="24"/>
-          <w:lang w:eastAsia="pt-BR"/>
-        </w:rPr>
-        <w:t>No que se refere às limitações, o sistema não terá como foco inicial a integração com plataformas externas complexas, como grandes marketplaces ou sistemas bancários avançados, concentrando-se nas operações essenciais das lojas de pequeno e médio porte.</w:t>
+        <w:t xml:space="preserve"> será responsável por permitir o cadastro e gerenciamento de clientes, fornecedores e vendedores, além de possibilitar o controle de entradas e saídas de produtos. O sistema também contemplará funcionalidades de vendas online, integrando o fluxo de pedidos com o controle de estoque, fornecendo informações atualizadas ao setor administrativo. Dessa forma, o software contribuirá para a centralização das informações e para a tomada de decisões mais assertivas. No que se refere às limitações, o sistema não terá como foco inicial a integração com plataformas externas complexas, como grandes marketplaces ou sistemas bancários avançados, concentrando-se nas operações essenciais das lojas de pequeno e médio porte.</w:t>
       </w:r>
     </w:p>
     <w:p>
@@ -5198,70 +4896,14 @@
                 <w:szCs w:val="24"/>
               </w:rPr>
             </w:pPr>
-            <w:proofErr w:type="spellStart"/>
-            <w:r>
-              <w:rPr>
-                <w:rFonts w:ascii="Arial" w:hAnsi="Arial" w:cs="Arial"/>
-                <w:sz w:val="24"/>
-                <w:szCs w:val="24"/>
-              </w:rPr>
-              <w:t>HyperText</w:t>
-            </w:r>
-            <w:proofErr w:type="spellEnd"/>
-            <w:r>
-              <w:rPr>
-                <w:rFonts w:ascii="Arial" w:hAnsi="Arial" w:cs="Arial"/>
-                <w:sz w:val="24"/>
-                <w:szCs w:val="24"/>
-              </w:rPr>
-              <w:t xml:space="preserve"> </w:t>
-            </w:r>
-            <w:proofErr w:type="spellStart"/>
-            <w:r>
-              <w:rPr>
-                <w:rFonts w:ascii="Arial" w:hAnsi="Arial" w:cs="Arial"/>
-                <w:sz w:val="24"/>
-                <w:szCs w:val="24"/>
-              </w:rPr>
-              <w:t>Transfer</w:t>
-            </w:r>
-            <w:proofErr w:type="spellEnd"/>
-            <w:r>
-              <w:rPr>
-                <w:rFonts w:ascii="Arial" w:hAnsi="Arial" w:cs="Arial"/>
-                <w:sz w:val="24"/>
-                <w:szCs w:val="24"/>
-              </w:rPr>
-              <w:t xml:space="preserve"> </w:t>
-            </w:r>
-            <w:proofErr w:type="spellStart"/>
-            <w:r>
-              <w:rPr>
-                <w:rFonts w:ascii="Arial" w:hAnsi="Arial" w:cs="Arial"/>
-                <w:sz w:val="24"/>
-                <w:szCs w:val="24"/>
-              </w:rPr>
-              <w:t>Protocol</w:t>
-            </w:r>
-            <w:proofErr w:type="spellEnd"/>
-            <w:r>
-              <w:rPr>
-                <w:rFonts w:ascii="Arial" w:hAnsi="Arial" w:cs="Arial"/>
-                <w:sz w:val="24"/>
-                <w:szCs w:val="24"/>
-              </w:rPr>
-              <w:t xml:space="preserve"> </w:t>
-            </w:r>
-            <w:proofErr w:type="spellStart"/>
-            <w:r>
-              <w:rPr>
-                <w:rFonts w:ascii="Arial" w:hAnsi="Arial" w:cs="Arial"/>
-                <w:sz w:val="24"/>
-                <w:szCs w:val="24"/>
-              </w:rPr>
-              <w:t>Secure</w:t>
-            </w:r>
-            <w:proofErr w:type="spellEnd"/>
+            <w:r>
+              <w:rPr>
+                <w:rFonts w:ascii="Arial" w:hAnsi="Arial" w:cs="Arial"/>
+                <w:sz w:val="24"/>
+                <w:szCs w:val="24"/>
+              </w:rPr>
+              <w:t>HyperText Transfer Protocol Secure</w:t>
+            </w:r>
           </w:p>
         </w:tc>
       </w:tr>
@@ -5311,18 +4953,8 @@
                 <w:sz w:val="24"/>
                 <w:szCs w:val="24"/>
               </w:rPr>
-              <w:t xml:space="preserve">Random Access </w:t>
-            </w:r>
-            <w:proofErr w:type="spellStart"/>
-            <w:r>
-              <w:rPr>
-                <w:rFonts w:ascii="Arial" w:hAnsi="Arial" w:cs="Arial"/>
-                <w:sz w:val="24"/>
-                <w:szCs w:val="24"/>
-              </w:rPr>
-              <w:t>Memory</w:t>
-            </w:r>
-            <w:proofErr w:type="spellEnd"/>
+              <w:t>Random Access Memory</w:t>
+            </w:r>
           </w:p>
         </w:tc>
       </w:tr>
@@ -5366,41 +4998,13 @@
                 <w:szCs w:val="24"/>
               </w:rPr>
             </w:pPr>
-            <w:proofErr w:type="spellStart"/>
-            <w:r>
-              <w:rPr>
-                <w:rFonts w:ascii="Arial" w:hAnsi="Arial" w:cs="Arial"/>
-                <w:sz w:val="24"/>
-                <w:szCs w:val="24"/>
-              </w:rPr>
-              <w:t>Solid</w:t>
-            </w:r>
-            <w:proofErr w:type="spellEnd"/>
-            <w:r>
-              <w:rPr>
-                <w:rFonts w:ascii="Arial" w:hAnsi="Arial" w:cs="Arial"/>
-                <w:sz w:val="24"/>
-                <w:szCs w:val="24"/>
-              </w:rPr>
-              <w:t xml:space="preserve"> </w:t>
-            </w:r>
-            <w:proofErr w:type="spellStart"/>
-            <w:r>
-              <w:rPr>
-                <w:rFonts w:ascii="Arial" w:hAnsi="Arial" w:cs="Arial"/>
-                <w:sz w:val="24"/>
-                <w:szCs w:val="24"/>
-              </w:rPr>
-              <w:t>State</w:t>
-            </w:r>
-            <w:proofErr w:type="spellEnd"/>
-            <w:r>
-              <w:rPr>
-                <w:rFonts w:ascii="Arial" w:hAnsi="Arial" w:cs="Arial"/>
-                <w:sz w:val="24"/>
-                <w:szCs w:val="24"/>
-              </w:rPr>
-              <w:t xml:space="preserve"> Drive</w:t>
+            <w:r>
+              <w:rPr>
+                <w:rFonts w:ascii="Arial" w:hAnsi="Arial" w:cs="Arial"/>
+                <w:sz w:val="24"/>
+                <w:szCs w:val="24"/>
+              </w:rPr>
+              <w:t>Solid State Drive</w:t>
             </w:r>
           </w:p>
         </w:tc>
@@ -5451,36 +5055,8 @@
                 <w:sz w:val="24"/>
                 <w:szCs w:val="24"/>
               </w:rPr>
-              <w:t xml:space="preserve">Dynamic Host </w:t>
-            </w:r>
-            <w:proofErr w:type="spellStart"/>
-            <w:r>
-              <w:rPr>
-                <w:rFonts w:ascii="Arial" w:hAnsi="Arial" w:cs="Arial"/>
-                <w:sz w:val="24"/>
-                <w:szCs w:val="24"/>
-              </w:rPr>
-              <w:t>Configuration</w:t>
-            </w:r>
-            <w:proofErr w:type="spellEnd"/>
-            <w:r>
-              <w:rPr>
-                <w:rFonts w:ascii="Arial" w:hAnsi="Arial" w:cs="Arial"/>
-                <w:sz w:val="24"/>
-                <w:szCs w:val="24"/>
-              </w:rPr>
-              <w:t xml:space="preserve"> </w:t>
-            </w:r>
-            <w:proofErr w:type="spellStart"/>
-            <w:r>
-              <w:rPr>
-                <w:rFonts w:ascii="Arial" w:hAnsi="Arial" w:cs="Arial"/>
-                <w:sz w:val="24"/>
-                <w:szCs w:val="24"/>
-              </w:rPr>
-              <w:t>Protocol</w:t>
-            </w:r>
-            <w:proofErr w:type="spellEnd"/>
+              <w:t>Dynamic Host Configuration Protocol</w:t>
+            </w:r>
           </w:p>
         </w:tc>
       </w:tr>
@@ -5921,34 +5497,14 @@
                 <w:szCs w:val="24"/>
               </w:rPr>
             </w:pPr>
-            <w:proofErr w:type="spellStart"/>
-            <w:r>
-              <w:rPr>
-                <w:rFonts w:ascii="Arial" w:hAnsi="Arial" w:cs="Arial"/>
-                <w:sz w:val="24"/>
-                <w:szCs w:val="24"/>
-              </w:rPr>
-              <w:t>Amely</w:t>
-            </w:r>
-            <w:proofErr w:type="spellEnd"/>
-            <w:r>
-              <w:rPr>
-                <w:rFonts w:ascii="Arial" w:hAnsi="Arial" w:cs="Arial"/>
-                <w:sz w:val="24"/>
-                <w:szCs w:val="24"/>
-              </w:rPr>
-              <w:t xml:space="preserve"> </w:t>
-            </w:r>
-            <w:proofErr w:type="spellStart"/>
-            <w:r>
-              <w:rPr>
-                <w:rFonts w:ascii="Arial" w:hAnsi="Arial" w:cs="Arial"/>
-                <w:sz w:val="24"/>
-                <w:szCs w:val="24"/>
-              </w:rPr>
-              <w:t>Logistic</w:t>
-            </w:r>
-            <w:proofErr w:type="spellEnd"/>
+            <w:r>
+              <w:rPr>
+                <w:rFonts w:ascii="Arial" w:hAnsi="Arial" w:cs="Arial"/>
+                <w:sz w:val="24"/>
+                <w:szCs w:val="24"/>
+              </w:rPr>
+              <w:t>Amely Logistic</w:t>
+            </w:r>
           </w:p>
         </w:tc>
         <w:tc>
@@ -6005,23 +5561,7 @@
                 <w:sz w:val="24"/>
                 <w:szCs w:val="24"/>
               </w:rPr>
-              <w:t>14</w:t>
-            </w:r>
-            <w:r>
-              <w:rPr>
-                <w:rFonts w:ascii="Arial" w:hAnsi="Arial" w:cs="Arial"/>
-                <w:sz w:val="24"/>
-                <w:szCs w:val="24"/>
-              </w:rPr>
-              <w:t>/04/20</w:t>
-            </w:r>
-            <w:r>
-              <w:rPr>
-                <w:rFonts w:ascii="Arial" w:hAnsi="Arial" w:cs="Arial"/>
-                <w:sz w:val="24"/>
-                <w:szCs w:val="24"/>
-              </w:rPr>
-              <w:t>XX</w:t>
+              <w:t>14/04/20XX</w:t>
             </w:r>
           </w:p>
         </w:tc>
@@ -6583,79 +6123,7 @@
           <w:sz w:val="24"/>
           <w:szCs w:val="24"/>
         </w:rPr>
-        <w:t xml:space="preserve">Este documento </w:t>
-      </w:r>
-      <w:r>
-        <w:rPr>
-          <w:rFonts w:ascii="Arial" w:hAnsi="Arial" w:cs="Arial"/>
-          <w:sz w:val="24"/>
-          <w:szCs w:val="24"/>
-        </w:rPr>
-        <w:t>está</w:t>
-      </w:r>
-      <w:r>
-        <w:rPr>
-          <w:rFonts w:ascii="Arial" w:hAnsi="Arial" w:cs="Arial"/>
-          <w:sz w:val="24"/>
-          <w:szCs w:val="24"/>
-        </w:rPr>
-        <w:t xml:space="preserve">́ organizado em </w:t>
-      </w:r>
-      <w:r>
-        <w:rPr>
-          <w:rFonts w:ascii="Arial" w:hAnsi="Arial" w:cs="Arial"/>
-          <w:sz w:val="24"/>
-          <w:szCs w:val="24"/>
-        </w:rPr>
-        <w:t>capítulos</w:t>
-      </w:r>
-      <w:r>
-        <w:rPr>
-          <w:rFonts w:ascii="Arial" w:hAnsi="Arial" w:cs="Arial"/>
-          <w:sz w:val="24"/>
-          <w:szCs w:val="24"/>
-        </w:rPr>
-        <w:t xml:space="preserve">, sendo que os </w:t>
-      </w:r>
-      <w:r>
-        <w:rPr>
-          <w:rFonts w:ascii="Arial" w:hAnsi="Arial" w:cs="Arial"/>
-          <w:sz w:val="24"/>
-          <w:szCs w:val="24"/>
-        </w:rPr>
-        <w:t>capítulos</w:t>
-      </w:r>
-      <w:r>
-        <w:rPr>
-          <w:rFonts w:ascii="Arial" w:hAnsi="Arial" w:cs="Arial"/>
-          <w:sz w:val="24"/>
-          <w:szCs w:val="24"/>
-        </w:rPr>
-        <w:t xml:space="preserve"> posteriores trataram de expor os requisitos de sistema. No </w:t>
-      </w:r>
-      <w:r>
-        <w:rPr>
-          <w:rFonts w:ascii="Arial" w:hAnsi="Arial" w:cs="Arial"/>
-          <w:sz w:val="24"/>
-          <w:szCs w:val="24"/>
-        </w:rPr>
-        <w:t>Capítulo</w:t>
-      </w:r>
-      <w:r>
-        <w:rPr>
-          <w:rFonts w:ascii="Arial" w:hAnsi="Arial" w:cs="Arial"/>
-          <w:sz w:val="24"/>
-          <w:szCs w:val="24"/>
-        </w:rPr>
-        <w:t xml:space="preserve"> 2 é apresentada uma descrição geral do produto, contendo as perspectivas do mesmo, suas funções, características do usuário, restrições, dependências e suposições a serem consideradas no desenvolvimento e implantação do sistema e os requisitos a serem adiados. No Capítulo 3 são apresentados os requisitos específicos, </w:t>
-      </w:r>
-      <w:r>
-        <w:rPr>
-          <w:rFonts w:ascii="Arial" w:hAnsi="Arial" w:cs="Arial"/>
-          <w:sz w:val="24"/>
-          <w:szCs w:val="24"/>
-        </w:rPr>
-        <w:t>como os principais diagramas e prototipação. No capítulo 4, serão apresentados os anexos utilizados para a engenharia do software. No Capítulo 5, estão relacionados os históricos de versão da ERS</w:t>
+        <w:t>Este documento está́ organizado em capítulos, sendo que os capítulos posteriores trataram de expor os requisitos de sistema. No Capítulo 2 é apresentada uma descrição geral do produto, contendo as perspectivas do mesmo, suas funções, características do usuário, restrições, dependências e suposições a serem consideradas no desenvolvimento e implantação do sistema e os requisitos a serem adiados. No Capítulo 3 são apresentados os requisitos específicos, como os principais diagramas e prototipação. No capítulo 4, serão apresentados os anexos utilizados para a engenharia do software. No Capítulo 5, estão relacionados os históricos de versão da ERS</w:t>
       </w:r>
     </w:p>
     <w:p>
@@ -6743,61 +6211,7 @@
           <w:sz w:val="24"/>
           <w:szCs w:val="24"/>
         </w:rPr>
-        <w:t xml:space="preserve">O </w:t>
-      </w:r>
-      <w:proofErr w:type="spellStart"/>
-      <w:r>
-        <w:rPr>
-          <w:rFonts w:ascii="Arial" w:eastAsia="Calibri" w:hAnsi="Arial" w:cs="Arial"/>
-          <w:sz w:val="24"/>
-          <w:szCs w:val="24"/>
-        </w:rPr>
-        <w:t>Amely</w:t>
-      </w:r>
-      <w:proofErr w:type="spellEnd"/>
-      <w:r>
-        <w:rPr>
-          <w:rFonts w:ascii="Arial" w:eastAsia="Calibri" w:hAnsi="Arial" w:cs="Arial"/>
-          <w:sz w:val="24"/>
-          <w:szCs w:val="24"/>
-        </w:rPr>
-        <w:t xml:space="preserve"> </w:t>
-      </w:r>
-      <w:proofErr w:type="spellStart"/>
-      <w:r>
-        <w:rPr>
-          <w:rFonts w:ascii="Arial" w:eastAsia="Calibri" w:hAnsi="Arial" w:cs="Arial"/>
-          <w:sz w:val="24"/>
-          <w:szCs w:val="24"/>
-        </w:rPr>
-        <w:t>Logistic</w:t>
-      </w:r>
-      <w:proofErr w:type="spellEnd"/>
-      <w:r>
-        <w:rPr>
-          <w:rFonts w:ascii="Arial" w:eastAsia="Calibri" w:hAnsi="Arial" w:cs="Arial"/>
-          <w:sz w:val="24"/>
-          <w:szCs w:val="24"/>
-        </w:rPr>
-        <w:t xml:space="preserve"> é um sistema </w:t>
-      </w:r>
-      <w:proofErr w:type="spellStart"/>
-      <w:r>
-        <w:rPr>
-          <w:rFonts w:ascii="Arial" w:eastAsia="Calibri" w:hAnsi="Arial" w:cs="Arial"/>
-          <w:sz w:val="24"/>
-          <w:szCs w:val="24"/>
-        </w:rPr>
-        <w:t>standalone</w:t>
-      </w:r>
-      <w:proofErr w:type="spellEnd"/>
-      <w:r>
-        <w:rPr>
-          <w:rFonts w:ascii="Arial" w:eastAsia="Calibri" w:hAnsi="Arial" w:cs="Arial"/>
-          <w:sz w:val="24"/>
-          <w:szCs w:val="24"/>
-        </w:rPr>
-        <w:t xml:space="preserve"> voltado à gestão de lojas de bairro, interagindo com serviços externos pontuais para complementar suas funcionalidades. O sistema se comunica com o serviço online dos Correios para consulta e preenchimento automático de endereços a partir do CEP informado. Para as funcionalidades de vendas online, utiliza protocolo HTTPS para troca de dados entre cliente e servidor.</w:t>
+        <w:t>O Amely Logistic é um sistema standalone voltado à gestão de lojas de bairro, interagindo com serviços externos pontuais para complementar suas funcionalidades. O sistema se comunica com o serviço online dos Correios para consulta e preenchimento automático de endereços a partir do CEP informado. Para as funcionalidades de vendas online, utiliza protocolo HTTPS para troca de dados entre cliente e servidor.</w:t>
       </w:r>
     </w:p>
     <w:p>
@@ -7783,15 +7197,7 @@
                 <w:sz w:val="24"/>
                 <w:szCs w:val="24"/>
               </w:rPr>
-              <w:t>Superior</w:t>
-            </w:r>
-            <w:r>
-              <w:rPr>
-                <w:rFonts w:ascii="Arial" w:hAnsi="Arial" w:cs="Arial"/>
-                <w:sz w:val="24"/>
-                <w:szCs w:val="24"/>
-              </w:rPr>
-              <w:t xml:space="preserve"> ou técnico</w:t>
+              <w:t>Superior ou técnico</w:t>
             </w:r>
           </w:p>
         </w:tc>
@@ -8238,25 +7644,7 @@
           <w:sz w:val="24"/>
           <w:szCs w:val="24"/>
         </w:rPr>
-        <w:t xml:space="preserve">O sistema não contemplará, nesta versão, integração com grandes marketplaces (como Mercado Livre ou </w:t>
-      </w:r>
-      <w:proofErr w:type="spellStart"/>
-      <w:r>
-        <w:rPr>
-          <w:rFonts w:ascii="Arial" w:eastAsia="Calibri" w:hAnsi="Arial" w:cs="Arial"/>
-          <w:sz w:val="24"/>
-          <w:szCs w:val="24"/>
-        </w:rPr>
-        <w:t>Shopee</w:t>
-      </w:r>
-      <w:proofErr w:type="spellEnd"/>
-      <w:r>
-        <w:rPr>
-          <w:rFonts w:ascii="Arial" w:eastAsia="Calibri" w:hAnsi="Arial" w:cs="Arial"/>
-          <w:sz w:val="24"/>
-          <w:szCs w:val="24"/>
-        </w:rPr>
-        <w:t xml:space="preserve">) nem com sistemas bancários avançados, concentrando-se nas operações essenciais da loja. </w:t>
+        <w:t xml:space="preserve">O sistema não contemplará, nesta versão, integração com grandes marketplaces (como Mercado Livre ou Shopee) nem com sistemas bancários avançados, concentrando-se nas operações essenciais da loja. </w:t>
       </w:r>
     </w:p>
     <w:p>
@@ -8458,43 +7846,7 @@
           <w:sz w:val="24"/>
           <w:szCs w:val="24"/>
         </w:rPr>
-        <w:t xml:space="preserve">Integração com grandes plataformas de marketplace (Mercado Livre, </w:t>
-      </w:r>
-      <w:proofErr w:type="spellStart"/>
-      <w:r>
-        <w:rPr>
-          <w:rFonts w:ascii="Arial" w:eastAsia="Calibri" w:hAnsi="Arial" w:cs="Arial"/>
-          <w:sz w:val="24"/>
-          <w:szCs w:val="24"/>
-        </w:rPr>
-        <w:t>Shopee</w:t>
-      </w:r>
-      <w:proofErr w:type="spellEnd"/>
-      <w:r>
-        <w:rPr>
-          <w:rFonts w:ascii="Arial" w:eastAsia="Calibri" w:hAnsi="Arial" w:cs="Arial"/>
-          <w:sz w:val="24"/>
-          <w:szCs w:val="24"/>
-        </w:rPr>
-        <w:t xml:space="preserve">, </w:t>
-      </w:r>
-      <w:proofErr w:type="spellStart"/>
-      <w:r>
-        <w:rPr>
-          <w:rFonts w:ascii="Arial" w:eastAsia="Calibri" w:hAnsi="Arial" w:cs="Arial"/>
-          <w:sz w:val="24"/>
-          <w:szCs w:val="24"/>
-        </w:rPr>
-        <w:t>Amazon</w:t>
-      </w:r>
-      <w:proofErr w:type="spellEnd"/>
-      <w:r>
-        <w:rPr>
-          <w:rFonts w:ascii="Arial" w:eastAsia="Calibri" w:hAnsi="Arial" w:cs="Arial"/>
-          <w:sz w:val="24"/>
-          <w:szCs w:val="24"/>
-        </w:rPr>
-        <w:t>, etc.);</w:t>
+        <w:t>Integração com grandes plataformas de marketplace (Mercado Livre, Shopee, Amazon, etc.);</w:t>
       </w:r>
     </w:p>
     <w:p>
@@ -8725,7 +8077,6 @@
                 <w:szCs w:val="24"/>
               </w:rPr>
             </w:pPr>
-            <w:proofErr w:type="spellStart"/>
             <w:r>
               <w:rPr>
                 <w:rFonts w:ascii="Arial" w:hAnsi="Arial" w:cs="Arial"/>
@@ -8734,7 +8085,6 @@
               </w:rPr>
               <w:t>Qtde</w:t>
             </w:r>
-            <w:proofErr w:type="spellEnd"/>
           </w:p>
         </w:tc>
         <w:tc>
@@ -8756,23 +8106,13 @@
                 <w:szCs w:val="24"/>
               </w:rPr>
             </w:pPr>
-            <w:proofErr w:type="spellStart"/>
-            <w:r>
-              <w:rPr>
-                <w:rFonts w:ascii="Arial" w:hAnsi="Arial" w:cs="Arial"/>
-                <w:sz w:val="24"/>
-                <w:szCs w:val="24"/>
-              </w:rPr>
-              <w:t>Vlr</w:t>
-            </w:r>
-            <w:proofErr w:type="spellEnd"/>
-            <w:r>
-              <w:rPr>
-                <w:rFonts w:ascii="Arial" w:hAnsi="Arial" w:cs="Arial"/>
-                <w:sz w:val="24"/>
-                <w:szCs w:val="24"/>
-              </w:rPr>
-              <w:t xml:space="preserve"> Unitário</w:t>
+            <w:r>
+              <w:rPr>
+                <w:rFonts w:ascii="Arial" w:hAnsi="Arial" w:cs="Arial"/>
+                <w:sz w:val="24"/>
+                <w:szCs w:val="24"/>
+              </w:rPr>
+              <w:t>Vlr Unitário</w:t>
             </w:r>
           </w:p>
         </w:tc>
@@ -8795,23 +8135,13 @@
                 <w:szCs w:val="24"/>
               </w:rPr>
             </w:pPr>
-            <w:proofErr w:type="spellStart"/>
-            <w:r>
-              <w:rPr>
-                <w:rFonts w:ascii="Arial" w:hAnsi="Arial" w:cs="Arial"/>
-                <w:sz w:val="24"/>
-                <w:szCs w:val="24"/>
-              </w:rPr>
-              <w:t>Vlt</w:t>
-            </w:r>
-            <w:proofErr w:type="spellEnd"/>
-            <w:r>
-              <w:rPr>
-                <w:rFonts w:ascii="Arial" w:hAnsi="Arial" w:cs="Arial"/>
-                <w:sz w:val="24"/>
-                <w:szCs w:val="24"/>
-              </w:rPr>
-              <w:t xml:space="preserve"> Total</w:t>
+            <w:r>
+              <w:rPr>
+                <w:rFonts w:ascii="Arial" w:hAnsi="Arial" w:cs="Arial"/>
+                <w:sz w:val="24"/>
+                <w:szCs w:val="24"/>
+              </w:rPr>
+              <w:t>Vlt Total</w:t>
             </w:r>
           </w:p>
         </w:tc>
@@ -8932,15 +8262,7 @@
                 <w:sz w:val="24"/>
                 <w:szCs w:val="24"/>
               </w:rPr>
-              <w:t xml:space="preserve">R$ </w:t>
-            </w:r>
-            <w:r>
-              <w:rPr>
-                <w:rFonts w:ascii="Arial" w:hAnsi="Arial" w:cs="Arial"/>
-                <w:sz w:val="24"/>
-                <w:szCs w:val="24"/>
-              </w:rPr>
-              <w:t>4.000,00</w:t>
+              <w:t>R$ 4.000,00</w:t>
             </w:r>
           </w:p>
         </w:tc>
@@ -8969,15 +8291,7 @@
                 <w:sz w:val="24"/>
                 <w:szCs w:val="24"/>
               </w:rPr>
-              <w:t xml:space="preserve">R$ </w:t>
-            </w:r>
-            <w:r>
-              <w:rPr>
-                <w:rFonts w:ascii="Arial" w:hAnsi="Arial" w:cs="Arial"/>
-                <w:sz w:val="24"/>
-                <w:szCs w:val="24"/>
-              </w:rPr>
-              <w:t>16.000,00</w:t>
+              <w:t>R$ 16.000,00</w:t>
             </w:r>
           </w:p>
         </w:tc>
@@ -9034,23 +8348,13 @@
                 <w:szCs w:val="24"/>
               </w:rPr>
             </w:pPr>
-            <w:proofErr w:type="spellStart"/>
-            <w:r>
-              <w:rPr>
-                <w:rFonts w:ascii="Arial" w:hAnsi="Arial" w:cs="Arial"/>
-                <w:sz w:val="24"/>
-                <w:szCs w:val="24"/>
-              </w:rPr>
-              <w:t>Noobreak</w:t>
-            </w:r>
-            <w:proofErr w:type="spellEnd"/>
-            <w:r>
-              <w:rPr>
-                <w:rFonts w:ascii="Arial" w:hAnsi="Arial" w:cs="Arial"/>
-                <w:sz w:val="24"/>
-                <w:szCs w:val="24"/>
-              </w:rPr>
-              <w:t xml:space="preserve"> SMS</w:t>
+            <w:r>
+              <w:rPr>
+                <w:rFonts w:ascii="Arial" w:hAnsi="Arial" w:cs="Arial"/>
+                <w:sz w:val="24"/>
+                <w:szCs w:val="24"/>
+              </w:rPr>
+              <w:t>Noobreak SMS</w:t>
             </w:r>
           </w:p>
         </w:tc>
@@ -9108,15 +8412,7 @@
                 <w:sz w:val="24"/>
                 <w:szCs w:val="24"/>
               </w:rPr>
-              <w:t xml:space="preserve">R$ </w:t>
-            </w:r>
-            <w:r>
-              <w:rPr>
-                <w:rFonts w:ascii="Arial" w:hAnsi="Arial" w:cs="Arial"/>
-                <w:sz w:val="24"/>
-                <w:szCs w:val="24"/>
-              </w:rPr>
-              <w:t>200,00</w:t>
+              <w:t>R$ 200,00</w:t>
             </w:r>
           </w:p>
         </w:tc>
@@ -9145,15 +8441,7 @@
                 <w:sz w:val="24"/>
                 <w:szCs w:val="24"/>
               </w:rPr>
-              <w:t xml:space="preserve">R$ </w:t>
-            </w:r>
-            <w:r>
-              <w:rPr>
-                <w:rFonts w:ascii="Arial" w:hAnsi="Arial" w:cs="Arial"/>
-                <w:sz w:val="24"/>
-                <w:szCs w:val="24"/>
-              </w:rPr>
-              <w:t>800,00</w:t>
+              <w:t>R$ 800,00</w:t>
             </w:r>
           </w:p>
         </w:tc>
@@ -9216,18 +8504,8 @@
                 <w:sz w:val="24"/>
                 <w:szCs w:val="24"/>
               </w:rPr>
-              <w:t xml:space="preserve">Roteador </w:t>
-            </w:r>
-            <w:proofErr w:type="spellStart"/>
-            <w:r>
-              <w:rPr>
-                <w:rFonts w:ascii="Arial" w:hAnsi="Arial" w:cs="Arial"/>
-                <w:sz w:val="24"/>
-                <w:szCs w:val="24"/>
-              </w:rPr>
-              <w:t>Wi-fi</w:t>
-            </w:r>
-            <w:proofErr w:type="spellEnd"/>
+              <w:t>Roteador Wi-fi</w:t>
+            </w:r>
           </w:p>
         </w:tc>
         <w:tc>
@@ -9526,25 +8804,7 @@
                 <w:sz w:val="24"/>
                 <w:szCs w:val="24"/>
               </w:rPr>
-              <w:t xml:space="preserve">Licença </w:t>
-            </w:r>
-            <w:proofErr w:type="gramStart"/>
-            <w:r>
-              <w:rPr>
-                <w:rFonts w:ascii="Arial" w:hAnsi="Arial" w:cs="Arial"/>
-                <w:sz w:val="24"/>
-                <w:szCs w:val="24"/>
-              </w:rPr>
-              <w:t>MySQL(</w:t>
-            </w:r>
-            <w:proofErr w:type="gramEnd"/>
-            <w:r>
-              <w:rPr>
-                <w:rFonts w:ascii="Arial" w:hAnsi="Arial" w:cs="Arial"/>
-                <w:sz w:val="24"/>
-                <w:szCs w:val="24"/>
-              </w:rPr>
-              <w:t>Gratuito)</w:t>
+              <w:t>Licença MySQL(Gratuito)</w:t>
             </w:r>
           </w:p>
         </w:tc>
@@ -9915,39 +9175,7 @@
                 <w:sz w:val="24"/>
                 <w:szCs w:val="24"/>
               </w:rPr>
-              <w:t xml:space="preserve">R$ </w:t>
-            </w:r>
-            <w:r>
-              <w:rPr>
-                <w:rFonts w:ascii="Arial" w:hAnsi="Arial" w:cs="Arial"/>
-                <w:sz w:val="24"/>
-                <w:szCs w:val="24"/>
-              </w:rPr>
-              <w:t>21</w:t>
-            </w:r>
-            <w:r>
-              <w:rPr>
-                <w:rFonts w:ascii="Arial" w:hAnsi="Arial" w:cs="Arial"/>
-                <w:sz w:val="24"/>
-                <w:szCs w:val="24"/>
-              </w:rPr>
-              <w:t>.</w:t>
-            </w:r>
-            <w:r>
-              <w:rPr>
-                <w:rFonts w:ascii="Arial" w:hAnsi="Arial" w:cs="Arial"/>
-                <w:sz w:val="24"/>
-                <w:szCs w:val="24"/>
-              </w:rPr>
-              <w:t>0</w:t>
-            </w:r>
-            <w:r>
-              <w:rPr>
-                <w:rFonts w:ascii="Arial" w:hAnsi="Arial" w:cs="Arial"/>
-                <w:sz w:val="24"/>
-                <w:szCs w:val="24"/>
-              </w:rPr>
-              <w:t>00,00</w:t>
+              <w:t>R$ 21.000,00</w:t>
             </w:r>
           </w:p>
         </w:tc>
@@ -10114,18 +9342,7 @@
           <w:sz w:val="24"/>
           <w:szCs w:val="24"/>
         </w:rPr>
-        <w:t>ANÁ</w:t>
-      </w:r>
-      <w:r>
-        <w:rPr>
-          <w:rStyle w:val="Ttulo1Char"/>
-          <w:rFonts w:ascii="Arial" w:hAnsi="Arial" w:cs="Arial"/>
-          <w:b/>
-          <w:color w:val="auto"/>
-          <w:sz w:val="24"/>
-          <w:szCs w:val="24"/>
-        </w:rPr>
-        <w:t>LISE ORIENTADA A OBJETOS</w:t>
+        <w:t>ANÁLISE ORIENTADA A OBJETOS</w:t>
       </w:r>
       <w:bookmarkEnd w:id="18"/>
       <w:bookmarkEnd w:id="19"/>
@@ -10274,7 +9491,7 @@
           </mc:Choice>
           <mc:Fallback>
             <w:pict>
-              <v:oval w14:anchorId="2351BA28" id="Elipse 1" o:spid="_x0000_s1026" style="position:absolute;margin-left:0;margin-top:47.65pt;width:26.25pt;height:108.75pt;z-index:251662336;visibility:visible;mso-wrap-style:square;mso-width-percent:0;mso-height-percent:0;mso-wrap-distance-left:9pt;mso-wrap-distance-top:0;mso-wrap-distance-right:9pt;mso-wrap-distance-bottom:0;mso-position-horizontal:left;mso-position-horizontal-relative:margin;mso-position-vertical:absolute;mso-position-vertical-relative:text;mso-width-percent:0;mso-height-percent:0;mso-width-relative:margin;mso-height-relative:margin;v-text-anchor:middle" o:gfxdata="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" fillcolor="white [3201]" strokecolor="white [3212]" strokeweight="1pt">
+              <v:oval w14:anchorId="2351BA28" id="Elipse 1" o:spid="_x0000_s1026" style="position:absolute;margin-left:0;margin-top:47.65pt;width:26.25pt;height:108.75pt;z-index:251662336;visibility:visible;mso-wrap-style:square;mso-width-percent:0;mso-height-percent:0;mso-wrap-distance-left:9pt;mso-wrap-distance-top:0;mso-wrap-distance-right:9pt;mso-wrap-distance-bottom:0;mso-position-horizontal:left;mso-position-horizontal-relative:margin;mso-position-vertical:absolute;mso-position-vertical-relative:text;mso-width-percent:0;mso-height-percent:0;mso-width-relative:margin;mso-height-relative:margin;v-text-anchor:middle" o:gfxdata="UEsDBBQABgAIAAAAIQC2gziS/gAAAOEBAAATAAAAW0NvbnRlbnRfVHlwZXNdLnhtbJSRQU7DMBBF 90jcwfIWJU67QAgl6YK0S0CoHGBkTxKLZGx5TGhvj5O2G0SRWNoz/78nu9wcxkFMGNg6quQqL6RA 0s5Y6ir5vt9lD1JwBDIwOMJKHpHlpr69KfdHjyxSmriSfYz+USnWPY7AufNIadK6MEJMx9ApD/oD OlTrorhX2lFEilmcO2RdNtjC5xDF9pCuTyYBB5bi6bQ4syoJ3g9WQ0ymaiLzg5KdCXlKLjvcW893 SUOqXwnz5DrgnHtJTxOsQfEKIT7DmDSUCaxw7Rqn8787ZsmRM9e2VmPeBN4uqYvTtW7jvijg9N/y JsXecLq0q+WD6m8AAAD//wMAUEsDBBQABgAIAAAAIQA4/SH/1gAAAJQBAAALAAAAX3JlbHMvLnJl bHOkkMFqwzAMhu+DvYPRfXGawxijTi+j0GvpHsDYimMaW0Yy2fr2M4PBMnrbUb/Q94l/f/hMi1qR JVI2sOt6UJgd+ZiDgffL8ekFlFSbvV0oo4EbChzGx4f9GRdb25HMsYhqlCwG5lrLq9biZkxWOiqY 22YiTra2kYMu1l1tQD30/bPm3wwYN0x18gb45AdQl1tp5j/sFB2T0FQ7R0nTNEV3j6o9feQzro1i OWA14Fm+Q8a1a8+Bvu/d/dMb2JY5uiPbhG/ktn4cqGU/er3pcvwCAAD//wMAUEsDBBQABgAIAAAA IQBPuA71ZQIAAC8FAAAOAAAAZHJzL2Uyb0RvYy54bWysVEtv2zAMvg/YfxB0Xx2nzwV1iqBFhwFF W6wdelZkKREmixqlxMl+/SjZcbI1p2E5KKTIjy9/1PXNprFsrTAYcBUvT0acKSehNm5R8e+v95+u OAtRuFpYcKriWxX4zfTjh+vWT9QYlmBrhYyCuDBpfcWXMfpJUQS5VI0IJ+CVI6MGbEQkFRdFjaKl 6I0txqPRRdEC1h5BqhDo9q4z8mmOr7WS8UnroCKzFafaYj4xn/N0FtNrMVmg8Esj+zLEP1TRCOMo 6RDqTkTBVmjehWqMRAig44mEpgCtjVS5B+qmHP3VzctSeJV7oeEEP4wp/L+w8nH94p+RxtD6MAkk pi42Gpv0T/WxTR7WdhiW2kQm6fKUfpfnnEkyladXZTk+T9Ms9miPIX5R0LAkVFxZa3xI/YiJWD+E 2HnvvNK1dekMYE19b6zNSmKCurXI1oK+4XxR9lkOvChnQhb7FrIUt1Z1Ub8pzUxNRY9z9syufUwh pXLxoo9rHXknmKYKBmB5DGjjrpjeN8FUZt0AHB0D/plxQOSs4OIAbowDPBag/jFk7vx33Xc9p/bn UG+fkSF0nA9e3hv6Dg8ixGeBRHJaB1rc+ESHttBWHHqJsyXgr2P3yZ+4R1bOWlqaioefK4GKM/vV ESs/l2dnacuycnZ+OSYFDy3zQ4tbNbdA37SkJ8LLLCb/aHeiRmjeaL9nKSuZhJOUu+Iy4k65jd0y 0wsh1WyW3WizvIgP7sXLFDxNNZHsdfMm0PdkjETjR9gt2DtCdr4J6WC2iqBNZut+rv28aSsz5fsX JK39oZ699u/c9DcAAAD//wMAUEsDBBQABgAIAAAAIQAl6mZB3QAAAAYBAAAPAAAAZHJzL2Rvd25y ZXYueG1sTI9LT8MwEITvSPwHa5G4IOo8FCghm4qHyrm0jcTRiZckIl5HsduEf485wXE0o5lvis1i BnGmyfWWEeJVBIK4sbrnFuF42N6uQTivWKvBMiF8k4NNeXlRqFzbmd/pvPetCCXscoXQeT/mUrqm I6Pcyo7Ewfu0k1E+yKmVelJzKDeDTKLoThrVc1jo1EgvHTVf+5NBuPmItiPfH6pql7718/E5Hl/r CvH6anl6BOFp8X9h+MUP6FAGptqeWDsxIIQjHuEhS0EEN0syEDVCGidrkGUh/+OXPwAAAP//AwBQ SwECLQAUAAYACAAAACEAtoM4kv4AAADhAQAAEwAAAAAAAAAAAAAAAAAAAAAAW0NvbnRlbnRfVHlw ZXNdLnhtbFBLAQItABQABgAIAAAAIQA4/SH/1gAAAJQBAAALAAAAAAAAAAAAAAAAAC8BAABfcmVs cy8ucmVsc1BLAQItABQABgAIAAAAIQBPuA71ZQIAAC8FAAAOAAAAAAAAAAAAAAAAAC4CAABkcnMv ZTJvRG9jLnhtbFBLAQItABQABgAIAAAAIQAl6mZB3QAAAAYBAAAPAAAAAAAAAAAAAAAAAL8EAABk cnMvZG93bnJldi54bWxQSwUGAAAAAAQABADzAAAAyQUAAAAA " fillcolor="white [3201]" strokecolor="white [3212]" strokeweight="1pt">
                 <v:stroke joinstyle="miter"/>
                 <w10:wrap anchorx="margin"/>
               </v:oval>
@@ -11079,21 +10296,7 @@
           <w:sz w:val="24"/>
           <w:szCs w:val="24"/>
         </w:rPr>
-        <w:t>:</w:t>
-      </w:r>
-      <w:r>
-        <w:rPr>
-          <w:sz w:val="24"/>
-          <w:szCs w:val="24"/>
-        </w:rPr>
-        <w:t xml:space="preserve"> </w:t>
-      </w:r>
-      <w:r>
-        <w:rPr>
-          <w:sz w:val="24"/>
-          <w:szCs w:val="24"/>
-        </w:rPr>
-        <w:t>Registrar Entrada de Produto no Estoque</w:t>
+        <w:t>: Registrar Entrada de Produto no Estoque</w:t>
       </w:r>
       <w:bookmarkEnd w:id="26"/>
     </w:p>
@@ -11651,17 +10854,7 @@
           <w:sz w:val="24"/>
           <w:szCs w:val="24"/>
         </w:rPr>
-        <w:t xml:space="preserve">3.2.1. </w:t>
-      </w:r>
-      <w:r>
-        <w:rPr>
-          <w:rFonts w:ascii="Arial" w:eastAsia="Calibri" w:hAnsi="Arial" w:cs="Arial"/>
-          <w:b/>
-          <w:bCs/>
-          <w:sz w:val="24"/>
-          <w:szCs w:val="24"/>
-        </w:rPr>
-        <w:t>CASO DE USO: RF_F03 – Processar Pedido Online</w:t>
+        <w:t>3.2.1. CASO DE USO: RF_F03 – Processar Pedido Online</w:t>
       </w:r>
     </w:p>
     <w:p>
@@ -12909,6 +12102,7 @@
           <w:sz w:val="24"/>
           <w:szCs w:val="24"/>
         </w:rPr>
+        <w:lastRenderedPageBreak/>
         <w:t>DIAGRAMA DE SEQUENCIA</w:t>
       </w:r>
       <w:bookmarkEnd w:id="31"/>
@@ -12933,8 +12127,8 @@
       <w:pPr>
         <w:pStyle w:val="Titulo3"/>
         <w:numPr>
-          <w:ilvl w:val="2"/>
-          <w:numId w:val="29"/>
+          <w:ilvl w:val="0"/>
+          <w:numId w:val="0"/>
         </w:numPr>
         <w:rPr>
           <w:rStyle w:val="Ttulo2Char"/>
@@ -12945,6 +12139,16 @@
         </w:rPr>
       </w:pPr>
       <w:bookmarkStart w:id="32" w:name="_Toc230631959"/>
+      <w:r>
+        <w:rPr>
+          <w:rStyle w:val="Ttulo2Char"/>
+          <w:rFonts w:ascii="Arial" w:hAnsi="Arial" w:cs="Arial"/>
+          <w:color w:val="auto"/>
+          <w:sz w:val="24"/>
+          <w:szCs w:val="24"/>
+        </w:rPr>
+        <w:t xml:space="preserve">3.5.1 </w:t>
+      </w:r>
       <w:r>
         <w:rPr>
           <w:rStyle w:val="Ttulo2Char"/>
@@ -12976,22 +12180,6 @@
         </w:rPr>
         <w:t>RF_F01 – Registrar Venda</w:t>
       </w:r>
-    </w:p>
-    <w:p>
-      <w:pPr>
-        <w:pStyle w:val="Titulo3"/>
-        <w:numPr>
-          <w:ilvl w:val="0"/>
-          <w:numId w:val="0"/>
-        </w:numPr>
-        <w:rPr>
-          <w:rStyle w:val="Ttulo2Char"/>
-          <w:rFonts w:ascii="Arial" w:hAnsi="Arial" w:cs="Arial"/>
-          <w:color w:val="auto"/>
-          <w:sz w:val="24"/>
-          <w:szCs w:val="24"/>
-        </w:rPr>
-      </w:pPr>
     </w:p>
     <w:p>
       <w:pPr>
@@ -13016,28 +12204,49 @@
         <w:jc w:val="both"/>
         <w:rPr>
           <w:rFonts w:ascii="Arial" w:eastAsia="Calibri" w:hAnsi="Arial" w:cs="Arial"/>
-          <w:color w:val="00B050"/>
-          <w:sz w:val="24"/>
-          <w:szCs w:val="24"/>
-        </w:rPr>
-      </w:pPr>
-      <w:r>
-        <w:rPr>
-          <w:rFonts w:ascii="Arial" w:eastAsia="Calibri" w:hAnsi="Arial" w:cs="Arial"/>
-          <w:color w:val="00B050"/>
-          <w:sz w:val="24"/>
-          <w:szCs w:val="24"/>
-        </w:rPr>
-        <w:t>Incluir o diagrama de sequência</w:t>
-      </w:r>
-      <w:r>
-        <w:rPr>
-          <w:rFonts w:ascii="Arial" w:eastAsia="Calibri" w:hAnsi="Arial" w:cs="Arial"/>
-          <w:color w:val="00B050"/>
-          <w:sz w:val="24"/>
-          <w:szCs w:val="24"/>
-        </w:rPr>
-        <w:t>.</w:t>
+          <w:sz w:val="24"/>
+          <w:szCs w:val="24"/>
+        </w:rPr>
+      </w:pPr>
+      <w:r>
+        <w:rPr>
+          <w:noProof/>
+        </w:rPr>
+        <w:drawing>
+          <wp:inline distT="0" distB="0" distL="0" distR="0" wp14:anchorId="268D97FA" wp14:editId="210C0E37">
+            <wp:extent cx="5303520" cy="7896671"/>
+            <wp:effectExtent l="0" t="0" r="0" b="0"/>
+            <wp:docPr id="100" name="DiagramaSequencia_RF_F01"/>
+            <wp:cNvGraphicFramePr>
+              <a:graphicFrameLocks xmlns:a="http://schemas.openxmlformats.org/drawingml/2006/main" noChangeAspect="1"/>
+            </wp:cNvGraphicFramePr>
+            <a:graphic xmlns:a="http://schemas.openxmlformats.org/drawingml/2006/main">
+              <a:graphicData uri="http://schemas.openxmlformats.org/drawingml/2006/picture">
+                <pic:pic xmlns:pic="http://schemas.openxmlformats.org/drawingml/2006/picture">
+                  <pic:nvPicPr>
+                    <pic:cNvPr id="100" name="DiagramaSequencia_RF_F01"/>
+                    <pic:cNvPicPr/>
+                  </pic:nvPicPr>
+                  <pic:blipFill>
+                    <a:blip r:embed="rId22"/>
+                    <a:stretch>
+                      <a:fillRect/>
+                    </a:stretch>
+                  </pic:blipFill>
+                  <pic:spPr>
+                    <a:xfrm>
+                      <a:off x="0" y="0"/>
+                      <a:ext cx="5303520" cy="7896671"/>
+                    </a:xfrm>
+                    <a:prstGeom prst="rect">
+                      <a:avLst/>
+                    </a:prstGeom>
+                  </pic:spPr>
+                </pic:pic>
+              </a:graphicData>
+            </a:graphic>
+          </wp:inline>
+        </w:drawing>
       </w:r>
     </w:p>
     <w:p>
@@ -13118,28 +12327,49 @@
         <w:jc w:val="both"/>
         <w:rPr>
           <w:rFonts w:ascii="Arial" w:eastAsia="Calibri" w:hAnsi="Arial" w:cs="Arial"/>
-          <w:color w:val="00B050"/>
-          <w:sz w:val="24"/>
-          <w:szCs w:val="24"/>
-        </w:rPr>
-      </w:pPr>
-      <w:r>
-        <w:rPr>
-          <w:rFonts w:ascii="Arial" w:eastAsia="Calibri" w:hAnsi="Arial" w:cs="Arial"/>
-          <w:color w:val="00B050"/>
-          <w:sz w:val="24"/>
-          <w:szCs w:val="24"/>
-        </w:rPr>
-        <w:t>Incluir o diagrama de sequência</w:t>
-      </w:r>
-      <w:r>
-        <w:rPr>
-          <w:rFonts w:ascii="Arial" w:eastAsia="Calibri" w:hAnsi="Arial" w:cs="Arial"/>
-          <w:color w:val="00B050"/>
-          <w:sz w:val="24"/>
-          <w:szCs w:val="24"/>
-        </w:rPr>
-        <w:t>.</w:t>
+          <w:sz w:val="24"/>
+          <w:szCs w:val="24"/>
+        </w:rPr>
+      </w:pPr>
+      <w:r>
+        <w:rPr>
+          <w:noProof/>
+        </w:rPr>
+        <w:drawing>
+          <wp:inline distT="0" distB="0" distL="0" distR="0" wp14:anchorId="668A16E4" wp14:editId="5A9D0A89">
+            <wp:extent cx="5303520" cy="6786202"/>
+            <wp:effectExtent l="0" t="0" r="0" b="0"/>
+            <wp:docPr id="101" name="DiagramaSequencia_RF_F02"/>
+            <wp:cNvGraphicFramePr>
+              <a:graphicFrameLocks xmlns:a="http://schemas.openxmlformats.org/drawingml/2006/main" noChangeAspect="1"/>
+            </wp:cNvGraphicFramePr>
+            <a:graphic xmlns:a="http://schemas.openxmlformats.org/drawingml/2006/main">
+              <a:graphicData uri="http://schemas.openxmlformats.org/drawingml/2006/picture">
+                <pic:pic xmlns:pic="http://schemas.openxmlformats.org/drawingml/2006/picture">
+                  <pic:nvPicPr>
+                    <pic:cNvPr id="101" name="DiagramaSequencia_RF_F02"/>
+                    <pic:cNvPicPr/>
+                  </pic:nvPicPr>
+                  <pic:blipFill>
+                    <a:blip r:embed="rId23"/>
+                    <a:stretch>
+                      <a:fillRect/>
+                    </a:stretch>
+                  </pic:blipFill>
+                  <pic:spPr>
+                    <a:xfrm>
+                      <a:off x="0" y="0"/>
+                      <a:ext cx="5303520" cy="6786202"/>
+                    </a:xfrm>
+                    <a:prstGeom prst="rect">
+                      <a:avLst/>
+                    </a:prstGeom>
+                  </pic:spPr>
+                </pic:pic>
+              </a:graphicData>
+            </a:graphic>
+          </wp:inline>
+        </w:drawing>
       </w:r>
     </w:p>
     <w:p>
@@ -13161,7 +12391,6 @@
           <w:ilvl w:val="2"/>
           <w:numId w:val="28"/>
         </w:numPr>
-        <w:ind w:left="708"/>
         <w:rPr>
           <w:rFonts w:eastAsia="Calibri"/>
           <w:color w:val="00B050"/>
@@ -13189,6 +12418,59 @@
           <w:szCs w:val="24"/>
         </w:rPr>
         <w:t>RF_F03 – Processar Pedido Online</w:t>
+      </w:r>
+    </w:p>
+    <w:p>
+      <w:pPr>
+        <w:ind w:left="708"/>
+        <w:jc w:val="both"/>
+        <w:rPr>
+          <w:rFonts w:ascii="Arial" w:eastAsia="Calibri" w:hAnsi="Arial" w:cs="Arial"/>
+          <w:sz w:val="24"/>
+          <w:szCs w:val="24"/>
+          <w:u w:val="single"/>
+        </w:rPr>
+      </w:pPr>
+      <w:r>
+        <w:rPr>
+          <w:noProof/>
+          <w:u w:val="single"/>
+        </w:rPr>
+        <w:drawing>
+          <wp:inline distT="0" distB="0" distL="0" distR="0" wp14:anchorId="55A9FE36" wp14:editId="758A52A7">
+            <wp:extent cx="5303520" cy="8495930"/>
+            <wp:effectExtent l="0" t="0" r="0" b="0"/>
+            <wp:docPr id="102" name="DiagramaSequencia_RF_F03"/>
+            <wp:cNvGraphicFramePr>
+              <a:graphicFrameLocks xmlns:a="http://schemas.openxmlformats.org/drawingml/2006/main" noChangeAspect="1"/>
+            </wp:cNvGraphicFramePr>
+            <a:graphic xmlns:a="http://schemas.openxmlformats.org/drawingml/2006/main">
+              <a:graphicData uri="http://schemas.openxmlformats.org/drawingml/2006/picture">
+                <pic:pic xmlns:pic="http://schemas.openxmlformats.org/drawingml/2006/picture">
+                  <pic:nvPicPr>
+                    <pic:cNvPr id="102" name="DiagramaSequencia_RF_F03"/>
+                    <pic:cNvPicPr/>
+                  </pic:nvPicPr>
+                  <pic:blipFill>
+                    <a:blip r:embed="rId24"/>
+                    <a:stretch>
+                      <a:fillRect/>
+                    </a:stretch>
+                  </pic:blipFill>
+                  <pic:spPr>
+                    <a:xfrm>
+                      <a:off x="0" y="0"/>
+                      <a:ext cx="5303520" cy="8495930"/>
+                    </a:xfrm>
+                    <a:prstGeom prst="rect">
+                      <a:avLst/>
+                    </a:prstGeom>
+                  </pic:spPr>
+                </pic:pic>
+              </a:graphicData>
+            </a:graphic>
+          </wp:inline>
+        </w:drawing>
       </w:r>
     </w:p>
     <w:p>
@@ -13254,7 +12536,7 @@
                     <pic:cNvPicPr/>
                   </pic:nvPicPr>
                   <pic:blipFill rotWithShape="1">
-                    <a:blip r:embed="rId22" cstate="print">
+                    <a:blip r:embed="rId25" cstate="print">
                       <a:extLst>
                         <a:ext uri="{28A0092B-C50C-407E-A947-70E740481C1C}">
                           <a14:useLocalDpi xmlns:a14="http://schemas.microsoft.com/office/drawing/2010/main" val="0"/>
@@ -13301,17 +12583,7 @@
           <w:sz w:val="24"/>
           <w:szCs w:val="24"/>
         </w:rPr>
-        <w:t>D</w:t>
-      </w:r>
-      <w:r>
-        <w:rPr>
-          <w:rStyle w:val="Ttulo2Char"/>
-          <w:rFonts w:ascii="Arial" w:hAnsi="Arial" w:cs="Arial"/>
-          <w:color w:val="auto"/>
-          <w:sz w:val="24"/>
-          <w:szCs w:val="24"/>
-        </w:rPr>
-        <w:t>IAGRAMA ENTIDADE RELACIONAMENTO</w:t>
+        <w:t>DIAGRAMA ENTIDADE RELACIONAMENTO</w:t>
       </w:r>
       <w:bookmarkEnd w:id="34"/>
     </w:p>
@@ -13407,16 +12679,7 @@
           <w:sz w:val="24"/>
           <w:szCs w:val="24"/>
         </w:rPr>
-        <w:t xml:space="preserve"> </w:t>
-      </w:r>
-      <w:r>
-        <w:rPr>
-          <w:rFonts w:ascii="Arial" w:hAnsi="Arial" w:cs="Arial"/>
-          <w:color w:val="auto"/>
-          <w:sz w:val="24"/>
-          <w:szCs w:val="24"/>
-        </w:rPr>
-        <w:t>PROTÓTIPO</w:t>
+        <w:t xml:space="preserve"> PROTÓTIPO</w:t>
       </w:r>
       <w:bookmarkEnd w:id="35"/>
     </w:p>
@@ -13496,42 +12759,7 @@
         <w:rPr>
           <w:rFonts w:ascii="Arial" w:hAnsi="Arial" w:cs="Arial"/>
         </w:rPr>
-        <w:t xml:space="preserve">Design corporativo e moderno, desenvolvido para facilitar o gerenciamento das operações da </w:t>
-      </w:r>
-      <w:proofErr w:type="spellStart"/>
-      <w:r>
-        <w:rPr>
-          <w:rFonts w:ascii="Arial" w:hAnsi="Arial" w:cs="Arial"/>
-        </w:rPr>
-        <w:t>Amely</w:t>
-      </w:r>
-      <w:proofErr w:type="spellEnd"/>
-      <w:r>
-        <w:rPr>
-          <w:rFonts w:ascii="Arial" w:hAnsi="Arial" w:cs="Arial"/>
-        </w:rPr>
-        <w:t xml:space="preserve"> </w:t>
-      </w:r>
-      <w:proofErr w:type="spellStart"/>
-      <w:r>
-        <w:rPr>
-          <w:rFonts w:ascii="Arial" w:hAnsi="Arial" w:cs="Arial"/>
-        </w:rPr>
-        <w:t>Logistic</w:t>
-      </w:r>
-      <w:proofErr w:type="spellEnd"/>
-      <w:r>
-        <w:rPr>
-          <w:rFonts w:ascii="Arial" w:hAnsi="Arial" w:cs="Arial"/>
-        </w:rPr>
-        <w:t xml:space="preserve">. A interface utiliza uma estrutura limpa e organizada, com menu lateral fixo para navegação entre os </w:t>
-      </w:r>
-      <w:r>
-        <w:rPr>
-          <w:rFonts w:ascii="Arial" w:hAnsi="Arial" w:cs="Arial"/>
-        </w:rPr>
-        <w:lastRenderedPageBreak/>
-        <w:t>módulos do sistema. O layout prioriza a produtividade do usuário, apresentando formulários, tabelas e indicadores de forma clara e intuitiva.</w:t>
+        <w:t>Design corporativo e moderno, desenvolvido para facilitar o gerenciamento das operações da Amely Logistic. A interface utiliza uma estrutura limpa e organizada, com menu lateral fixo para navegação entre os módulos do sistema. O layout prioriza a produtividade do usuário, apresentando formulários, tabelas e indicadores de forma clara e intuitiva.</w:t>
       </w:r>
     </w:p>
     <w:p>
@@ -13551,6 +12779,7 @@
           <w:sz w:val="24"/>
           <w:szCs w:val="24"/>
         </w:rPr>
+        <w:lastRenderedPageBreak/>
         <w:t>Paleta de cores</w:t>
       </w:r>
     </w:p>
@@ -14759,27 +13988,7 @@
         <w:rPr>
           <w:rFonts w:ascii="Arial" w:hAnsi="Arial" w:cs="Arial"/>
         </w:rPr>
-        <w:t xml:space="preserve">Fonte principal Segoe UI, utilizada em títulos, menus e </w:t>
-      </w:r>
-      <w:proofErr w:type="spellStart"/>
-      <w:r>
-        <w:rPr>
-          <w:rFonts w:ascii="Arial" w:hAnsi="Arial" w:cs="Arial"/>
-        </w:rPr>
-        <w:t>conteúdo</w:t>
-      </w:r>
-      <w:r>
-        <w:rPr>
-          <w:rFonts w:ascii="Arial" w:hAnsi="Arial" w:cs="Arial"/>
-        </w:rPr>
-        <w:t>s</w:t>
-      </w:r>
-      <w:proofErr w:type="spellEnd"/>
-      <w:r>
-        <w:rPr>
-          <w:rFonts w:ascii="Arial" w:hAnsi="Arial" w:cs="Arial"/>
-        </w:rPr>
-        <w:t xml:space="preserve"> do sistema. Os textos utilizam tamanho entre 14px e 16px para garantir boa legibilidade, enquanto títulos e cabeçalhos utilizam entre 18px e 22px em negrito para maior destaque visual.</w:t>
+        <w:t>Fonte principal Segoe UI, utilizada em títulos, menus e conteúdos do sistema. Os textos utilizam tamanho entre 14px e 16px para garantir boa legibilidade, enquanto títulos e cabeçalhos utilizam entre 18px e 22px em negrito para maior destaque visual.</w:t>
       </w:r>
     </w:p>
     <w:p>
@@ -14868,36 +14077,8 @@
           <w:b/>
           <w:color w:val="auto"/>
         </w:rPr>
-        <w:t xml:space="preserve">Identidade Visual da </w:t>
-      </w:r>
-      <w:proofErr w:type="spellStart"/>
-      <w:r>
-        <w:rPr>
-          <w:rFonts w:ascii="Arial" w:hAnsi="Arial" w:cs="Arial"/>
-          <w:b/>
-          <w:color w:val="auto"/>
-        </w:rPr>
-        <w:t>Amely</w:t>
-      </w:r>
-      <w:proofErr w:type="spellEnd"/>
-      <w:r>
-        <w:rPr>
-          <w:rFonts w:ascii="Arial" w:hAnsi="Arial" w:cs="Arial"/>
-          <w:b/>
-          <w:color w:val="auto"/>
-        </w:rPr>
-        <w:t xml:space="preserve"> </w:t>
-      </w:r>
-      <w:proofErr w:type="spellStart"/>
-      <w:r>
-        <w:rPr>
-          <w:rFonts w:ascii="Arial" w:hAnsi="Arial" w:cs="Arial"/>
-          <w:b/>
-          <w:color w:val="auto"/>
-        </w:rPr>
-        <w:t>Logistic</w:t>
-      </w:r>
-      <w:proofErr w:type="spellEnd"/>
+        <w:t>Identidade Visual da Amely Logistic</w:t>
+      </w:r>
     </w:p>
     <w:p>
       <w:pPr>
@@ -14912,42 +14093,7 @@
         <w:rPr>
           <w:rFonts w:ascii="Arial" w:hAnsi="Arial" w:cs="Arial"/>
         </w:rPr>
-        <w:t xml:space="preserve">A identidade visual da </w:t>
-      </w:r>
-      <w:proofErr w:type="spellStart"/>
-      <w:r>
-        <w:rPr>
-          <w:rFonts w:ascii="Arial" w:hAnsi="Arial" w:cs="Arial"/>
-        </w:rPr>
-        <w:t>Amely</w:t>
-      </w:r>
-      <w:proofErr w:type="spellEnd"/>
-      <w:r>
-        <w:rPr>
-          <w:rFonts w:ascii="Arial" w:hAnsi="Arial" w:cs="Arial"/>
-        </w:rPr>
-        <w:t xml:space="preserve"> </w:t>
-      </w:r>
-      <w:proofErr w:type="spellStart"/>
-      <w:r>
-        <w:rPr>
-          <w:rFonts w:ascii="Arial" w:hAnsi="Arial" w:cs="Arial"/>
-        </w:rPr>
-        <w:t>Logistic</w:t>
-      </w:r>
-      <w:proofErr w:type="spellEnd"/>
-      <w:r>
-        <w:rPr>
-          <w:rFonts w:ascii="Arial" w:hAnsi="Arial" w:cs="Arial"/>
-        </w:rPr>
-        <w:t xml:space="preserve"> foi projetada para transmitir organização, confiabilidade e profissionalismo. A combinação entre tons de azul </w:t>
-      </w:r>
-      <w:r>
-        <w:rPr>
-          <w:rFonts w:ascii="Arial" w:hAnsi="Arial" w:cs="Arial"/>
-        </w:rPr>
-        <w:lastRenderedPageBreak/>
-        <w:t>escuro, branco e cinza claro cria um ambiente corporativo moderno, enquanto a disposição dos elementos favorece a navegação rápida e o acesso eficiente às informações de clientes, vendas, estoque e entregas.</w:t>
+        <w:t>A identidade visual da Amely Logistic foi projetada para transmitir organização, confiabilidade e profissionalismo. A combinação entre tons de azul escuro, branco e cinza claro cria um ambiente corporativo moderno, enquanto a disposição dos elementos favorece a navegação rápida e o acesso eficiente às informações de clientes, vendas, estoque e entregas.</w:t>
       </w:r>
     </w:p>
     <w:p>
@@ -15145,7 +14291,7 @@
                     <pic:cNvPicPr/>
                   </pic:nvPicPr>
                   <pic:blipFill>
-                    <a:blip r:embed="rId23">
+                    <a:blip r:embed="rId26">
                       <a:extLst>
                         <a:ext uri="{28A0092B-C50C-407E-A947-70E740481C1C}">
                           <a14:useLocalDpi xmlns:a14="http://schemas.microsoft.com/office/drawing/2010/main" val="0"/>
@@ -15283,14 +14429,7 @@
           <w:b/>
           <w:bCs/>
         </w:rPr>
-        <w:t>RF_B02 – Gerenciar Fornecedo</w:t>
-      </w:r>
-      <w:r>
-        <w:rPr>
-          <w:b/>
-          <w:bCs/>
-        </w:rPr>
-        <w:t>r</w:t>
+        <w:t>RF_B02 – Gerenciar Fornecedor</w:t>
       </w:r>
     </w:p>
     <w:p>
@@ -15402,7 +14541,7 @@
                     <pic:cNvPicPr/>
                   </pic:nvPicPr>
                   <pic:blipFill>
-                    <a:blip r:embed="rId24">
+                    <a:blip r:embed="rId27">
                       <a:extLst>
                         <a:ext uri="{28A0092B-C50C-407E-A947-70E740481C1C}">
                           <a14:useLocalDpi xmlns:a14="http://schemas.microsoft.com/office/drawing/2010/main" val="0"/>
@@ -15625,28 +14764,7 @@
           <w:bCs/>
         </w:rPr>
         <w:lastRenderedPageBreak/>
-        <w:t>RF_B0</w:t>
-      </w:r>
-      <w:r>
-        <w:rPr>
-          <w:b/>
-          <w:bCs/>
-        </w:rPr>
-        <w:t>3</w:t>
-      </w:r>
-      <w:r>
-        <w:rPr>
-          <w:b/>
-          <w:bCs/>
-        </w:rPr>
-        <w:t xml:space="preserve"> – Gerenciar </w:t>
-      </w:r>
-      <w:r>
-        <w:rPr>
-          <w:b/>
-          <w:bCs/>
-        </w:rPr>
-        <w:t>Vendedores</w:t>
+        <w:t>RF_B03 – Gerenciar Vendedores</w:t>
       </w:r>
     </w:p>
     <w:p>
@@ -15747,7 +14865,7 @@
                     <pic:cNvPicPr/>
                   </pic:nvPicPr>
                   <pic:blipFill>
-                    <a:blip r:embed="rId25">
+                    <a:blip r:embed="rId28">
                       <a:extLst>
                         <a:ext uri="{28A0092B-C50C-407E-A947-70E740481C1C}">
                           <a14:useLocalDpi xmlns:a14="http://schemas.microsoft.com/office/drawing/2010/main" val="0"/>
@@ -15949,28 +15067,7 @@
           <w:bCs/>
         </w:rPr>
         <w:lastRenderedPageBreak/>
-        <w:t>RF_B0</w:t>
-      </w:r>
-      <w:r>
-        <w:rPr>
-          <w:b/>
-          <w:bCs/>
-        </w:rPr>
-        <w:t>4</w:t>
-      </w:r>
-      <w:r>
-        <w:rPr>
-          <w:b/>
-          <w:bCs/>
-        </w:rPr>
-        <w:t xml:space="preserve"> – Gerenciar </w:t>
-      </w:r>
-      <w:r>
-        <w:rPr>
-          <w:b/>
-          <w:bCs/>
-        </w:rPr>
-        <w:t>Produtos</w:t>
+        <w:t>RF_B04 – Gerenciar Produtos</w:t>
       </w:r>
     </w:p>
     <w:p>
@@ -16059,7 +15156,7 @@
                     <pic:cNvPicPr/>
                   </pic:nvPicPr>
                   <pic:blipFill>
-                    <a:blip r:embed="rId26">
+                    <a:blip r:embed="rId29">
                       <a:extLst>
                         <a:ext uri="{28A0092B-C50C-407E-A947-70E740481C1C}">
                           <a14:useLocalDpi xmlns:a14="http://schemas.microsoft.com/office/drawing/2010/main" val="0"/>
@@ -16163,16 +15260,7 @@
           <w:sz w:val="24"/>
           <w:szCs w:val="24"/>
         </w:rPr>
-        <w:t>APE</w:t>
-      </w:r>
-      <w:r>
-        <w:rPr>
-          <w:b/>
-          <w:bCs/>
-          <w:sz w:val="24"/>
-          <w:szCs w:val="24"/>
-        </w:rPr>
-        <w:t>NDICES</w:t>
+        <w:t>APENDICES</w:t>
       </w:r>
       <w:bookmarkEnd w:id="39"/>
     </w:p>
@@ -16230,16 +15318,7 @@
           <w:szCs w:val="24"/>
         </w:rPr>
         <w:lastRenderedPageBreak/>
-        <w:t xml:space="preserve">HISTÓRICO DE </w:t>
-      </w:r>
-      <w:r>
-        <w:rPr>
-          <w:b/>
-          <w:bCs/>
-          <w:sz w:val="24"/>
-          <w:szCs w:val="24"/>
-        </w:rPr>
-        <w:t>REVISÕES</w:t>
+        <w:t>HISTÓRICO DE REVISÕES</w:t>
       </w:r>
       <w:bookmarkEnd w:id="40"/>
     </w:p>
@@ -16431,52 +15510,14 @@
                 <w:szCs w:val="24"/>
               </w:rPr>
             </w:pPr>
-            <w:proofErr w:type="spellStart"/>
             <w:r>
               <w:rPr>
                 <w:bCs/>
                 <w:sz w:val="24"/>
                 <w:szCs w:val="24"/>
               </w:rPr>
-              <w:t>xx</w:t>
-            </w:r>
-            <w:proofErr w:type="spellEnd"/>
-            <w:r>
-              <w:rPr>
-                <w:bCs/>
-                <w:sz w:val="24"/>
-                <w:szCs w:val="24"/>
-              </w:rPr>
-              <w:t>/</w:t>
-            </w:r>
-            <w:proofErr w:type="spellStart"/>
-            <w:r>
-              <w:rPr>
-                <w:bCs/>
-                <w:sz w:val="24"/>
-                <w:szCs w:val="24"/>
-              </w:rPr>
-              <w:t>xx</w:t>
-            </w:r>
-            <w:proofErr w:type="spellEnd"/>
-            <w:r>
-              <w:rPr>
-                <w:bCs/>
-                <w:sz w:val="24"/>
-                <w:szCs w:val="24"/>
-              </w:rPr>
-              <w:t>/</w:t>
-            </w:r>
-            <w:proofErr w:type="spellStart"/>
-            <w:r>
-              <w:rPr>
-                <w:bCs/>
-                <w:sz w:val="24"/>
-                <w:szCs w:val="24"/>
-              </w:rPr>
-              <w:t>xx</w:t>
-            </w:r>
-            <w:proofErr w:type="spellEnd"/>
+              <w:t>xx/xx/xx</w:t>
+            </w:r>
           </w:p>
         </w:tc>
         <w:tc>
@@ -17443,7 +16484,7 @@
   <w:abstractNum w:abstractNumId="4" w15:restartNumberingAfterBreak="0">
     <w:nsid w:val="0A2E37A9"/>
     <w:multiLevelType w:val="multilevel"/>
-    <w:tmpl w:val="3FEA7554"/>
+    <w:tmpl w:val="D1320CB4"/>
     <w:lvl w:ilvl="0">
       <w:start w:val="3"/>
       <w:numFmt w:val="decimal"/>
@@ -17478,6 +16519,7 @@
       </w:pPr>
       <w:rPr>
         <w:rFonts w:hint="default"/>
+        <w:color w:val="auto"/>
       </w:rPr>
     </w:lvl>
     <w:lvl w:ilvl="3">

</xml_diff>